<commit_message>
finalisation du backend et frontend
</commit_message>
<xml_diff>
--- a/docs/Gestion de Budget.docx
+++ b/docs/Gestion de Budget.docx
@@ -207,25 +207,14 @@
           <w:lang w:eastAsia="fr-FR"/>
         </w:rPr>
       </w:pPr>
-      <w:proofErr w:type="gramStart"/>
-      <w:r>
-        <w:rPr>
-          <w:rFonts w:ascii="Times New Roman" w:eastAsia="Times New Roman" w:hAnsi="Times New Roman" w:cs="Times New Roman"/>
-          <w:sz w:val="24"/>
-          <w:szCs w:val="24"/>
-          <w:lang w:eastAsia="fr-FR"/>
-        </w:rPr>
-        <w:t>enregistrer</w:t>
-      </w:r>
-      <w:proofErr w:type="gramEnd"/>
-      <w:r>
-        <w:rPr>
-          <w:rFonts w:ascii="Times New Roman" w:eastAsia="Times New Roman" w:hAnsi="Times New Roman" w:cs="Times New Roman"/>
-          <w:sz w:val="24"/>
-          <w:szCs w:val="24"/>
-          <w:lang w:eastAsia="fr-FR"/>
-        </w:rPr>
-        <w:t xml:space="preserve"> ses revenus</w:t>
+      <w:r>
+        <w:rPr>
+          <w:rFonts w:ascii="Times New Roman" w:eastAsia="Times New Roman" w:hAnsi="Times New Roman" w:cs="Times New Roman"/>
+          <w:sz w:val="24"/>
+          <w:szCs w:val="24"/>
+          <w:lang w:eastAsia="fr-FR"/>
+        </w:rPr>
+        <w:t>enregistrer ses revenus</w:t>
       </w:r>
     </w:p>
     <w:p>
@@ -242,25 +231,14 @@
           <w:lang w:eastAsia="fr-FR"/>
         </w:rPr>
       </w:pPr>
-      <w:proofErr w:type="gramStart"/>
-      <w:r>
-        <w:rPr>
-          <w:rFonts w:ascii="Times New Roman" w:eastAsia="Times New Roman" w:hAnsi="Times New Roman" w:cs="Times New Roman"/>
-          <w:sz w:val="24"/>
-          <w:szCs w:val="24"/>
-          <w:lang w:eastAsia="fr-FR"/>
-        </w:rPr>
-        <w:t>enregistrer</w:t>
-      </w:r>
-      <w:proofErr w:type="gramEnd"/>
-      <w:r>
-        <w:rPr>
-          <w:rFonts w:ascii="Times New Roman" w:eastAsia="Times New Roman" w:hAnsi="Times New Roman" w:cs="Times New Roman"/>
-          <w:sz w:val="24"/>
-          <w:szCs w:val="24"/>
-          <w:lang w:eastAsia="fr-FR"/>
-        </w:rPr>
-        <w:t xml:space="preserve"> ses dépenses</w:t>
+      <w:r>
+        <w:rPr>
+          <w:rFonts w:ascii="Times New Roman" w:eastAsia="Times New Roman" w:hAnsi="Times New Roman" w:cs="Times New Roman"/>
+          <w:sz w:val="24"/>
+          <w:szCs w:val="24"/>
+          <w:lang w:eastAsia="fr-FR"/>
+        </w:rPr>
+        <w:t>enregistrer ses dépenses</w:t>
       </w:r>
     </w:p>
     <w:p>
@@ -277,25 +255,14 @@
           <w:lang w:eastAsia="fr-FR"/>
         </w:rPr>
       </w:pPr>
-      <w:proofErr w:type="gramStart"/>
-      <w:r>
-        <w:rPr>
-          <w:rFonts w:ascii="Times New Roman" w:eastAsia="Times New Roman" w:hAnsi="Times New Roman" w:cs="Times New Roman"/>
-          <w:sz w:val="24"/>
-          <w:szCs w:val="24"/>
-          <w:lang w:eastAsia="fr-FR"/>
-        </w:rPr>
-        <w:t>suivre</w:t>
-      </w:r>
-      <w:proofErr w:type="gramEnd"/>
-      <w:r>
-        <w:rPr>
-          <w:rFonts w:ascii="Times New Roman" w:eastAsia="Times New Roman" w:hAnsi="Times New Roman" w:cs="Times New Roman"/>
-          <w:sz w:val="24"/>
-          <w:szCs w:val="24"/>
-          <w:lang w:eastAsia="fr-FR"/>
-        </w:rPr>
-        <w:t xml:space="preserve"> son budget</w:t>
+      <w:r>
+        <w:rPr>
+          <w:rFonts w:ascii="Times New Roman" w:eastAsia="Times New Roman" w:hAnsi="Times New Roman" w:cs="Times New Roman"/>
+          <w:sz w:val="24"/>
+          <w:szCs w:val="24"/>
+          <w:lang w:eastAsia="fr-FR"/>
+        </w:rPr>
+        <w:t>suivre son budget</w:t>
       </w:r>
     </w:p>
     <w:p>
@@ -312,25 +279,14 @@
           <w:lang w:eastAsia="fr-FR"/>
         </w:rPr>
       </w:pPr>
-      <w:proofErr w:type="gramStart"/>
-      <w:r>
-        <w:rPr>
-          <w:rFonts w:ascii="Times New Roman" w:eastAsia="Times New Roman" w:hAnsi="Times New Roman" w:cs="Times New Roman"/>
-          <w:sz w:val="24"/>
-          <w:szCs w:val="24"/>
-          <w:lang w:eastAsia="fr-FR"/>
-        </w:rPr>
-        <w:t>analyser</w:t>
-      </w:r>
-      <w:proofErr w:type="gramEnd"/>
-      <w:r>
-        <w:rPr>
-          <w:rFonts w:ascii="Times New Roman" w:eastAsia="Times New Roman" w:hAnsi="Times New Roman" w:cs="Times New Roman"/>
-          <w:sz w:val="24"/>
-          <w:szCs w:val="24"/>
-          <w:lang w:eastAsia="fr-FR"/>
-        </w:rPr>
-        <w:t xml:space="preserve"> ses finances</w:t>
+      <w:r>
+        <w:rPr>
+          <w:rFonts w:ascii="Times New Roman" w:eastAsia="Times New Roman" w:hAnsi="Times New Roman" w:cs="Times New Roman"/>
+          <w:sz w:val="24"/>
+          <w:szCs w:val="24"/>
+          <w:lang w:eastAsia="fr-FR"/>
+        </w:rPr>
+        <w:t>analyser ses finances</w:t>
       </w:r>
     </w:p>
     <w:p>
@@ -347,25 +303,14 @@
           <w:lang w:eastAsia="fr-FR"/>
         </w:rPr>
       </w:pPr>
-      <w:proofErr w:type="gramStart"/>
-      <w:r>
-        <w:rPr>
-          <w:rFonts w:ascii="Times New Roman" w:eastAsia="Times New Roman" w:hAnsi="Times New Roman" w:cs="Times New Roman"/>
-          <w:sz w:val="24"/>
-          <w:szCs w:val="24"/>
-          <w:lang w:eastAsia="fr-FR"/>
-        </w:rPr>
-        <w:t>visualiser</w:t>
-      </w:r>
-      <w:proofErr w:type="gramEnd"/>
-      <w:r>
-        <w:rPr>
-          <w:rFonts w:ascii="Times New Roman" w:eastAsia="Times New Roman" w:hAnsi="Times New Roman" w:cs="Times New Roman"/>
-          <w:sz w:val="24"/>
-          <w:szCs w:val="24"/>
-          <w:lang w:eastAsia="fr-FR"/>
-        </w:rPr>
-        <w:t xml:space="preserve"> ses statistiques</w:t>
+      <w:r>
+        <w:rPr>
+          <w:rFonts w:ascii="Times New Roman" w:eastAsia="Times New Roman" w:hAnsi="Times New Roman" w:cs="Times New Roman"/>
+          <w:sz w:val="24"/>
+          <w:szCs w:val="24"/>
+          <w:lang w:eastAsia="fr-FR"/>
+        </w:rPr>
+        <w:t>visualiser ses statistiques</w:t>
       </w:r>
     </w:p>
     <w:p>
@@ -451,25 +396,14 @@
           <w:lang w:eastAsia="fr-FR"/>
         </w:rPr>
       </w:pPr>
-      <w:proofErr w:type="gramStart"/>
-      <w:r>
-        <w:rPr>
-          <w:rFonts w:ascii="Times New Roman" w:eastAsia="Times New Roman" w:hAnsi="Times New Roman" w:cs="Times New Roman"/>
-          <w:sz w:val="24"/>
-          <w:szCs w:val="24"/>
-          <w:lang w:eastAsia="fr-FR"/>
-        </w:rPr>
-        <w:t>ne</w:t>
-      </w:r>
-      <w:proofErr w:type="gramEnd"/>
-      <w:r>
-        <w:rPr>
-          <w:rFonts w:ascii="Times New Roman" w:eastAsia="Times New Roman" w:hAnsi="Times New Roman" w:cs="Times New Roman"/>
-          <w:sz w:val="24"/>
-          <w:szCs w:val="24"/>
-          <w:lang w:eastAsia="fr-FR"/>
-        </w:rPr>
-        <w:t xml:space="preserve"> savent pas où part leur argent</w:t>
+      <w:r>
+        <w:rPr>
+          <w:rFonts w:ascii="Times New Roman" w:eastAsia="Times New Roman" w:hAnsi="Times New Roman" w:cs="Times New Roman"/>
+          <w:sz w:val="24"/>
+          <w:szCs w:val="24"/>
+          <w:lang w:eastAsia="fr-FR"/>
+        </w:rPr>
+        <w:t>ne savent pas où part leur argent</w:t>
       </w:r>
     </w:p>
     <w:p>
@@ -486,25 +420,14 @@
           <w:lang w:eastAsia="fr-FR"/>
         </w:rPr>
       </w:pPr>
-      <w:proofErr w:type="gramStart"/>
-      <w:r>
-        <w:rPr>
-          <w:rFonts w:ascii="Times New Roman" w:eastAsia="Times New Roman" w:hAnsi="Times New Roman" w:cs="Times New Roman"/>
-          <w:sz w:val="24"/>
-          <w:szCs w:val="24"/>
-          <w:lang w:eastAsia="fr-FR"/>
-        </w:rPr>
-        <w:t>dépassent</w:t>
-      </w:r>
-      <w:proofErr w:type="gramEnd"/>
-      <w:r>
-        <w:rPr>
-          <w:rFonts w:ascii="Times New Roman" w:eastAsia="Times New Roman" w:hAnsi="Times New Roman" w:cs="Times New Roman"/>
-          <w:sz w:val="24"/>
-          <w:szCs w:val="24"/>
-          <w:lang w:eastAsia="fr-FR"/>
-        </w:rPr>
-        <w:t xml:space="preserve"> leur budget mensuel</w:t>
+      <w:r>
+        <w:rPr>
+          <w:rFonts w:ascii="Times New Roman" w:eastAsia="Times New Roman" w:hAnsi="Times New Roman" w:cs="Times New Roman"/>
+          <w:sz w:val="24"/>
+          <w:szCs w:val="24"/>
+          <w:lang w:eastAsia="fr-FR"/>
+        </w:rPr>
+        <w:t>dépassent leur budget mensuel</w:t>
       </w:r>
     </w:p>
     <w:p>
@@ -521,25 +444,14 @@
           <w:lang w:eastAsia="fr-FR"/>
         </w:rPr>
       </w:pPr>
-      <w:proofErr w:type="gramStart"/>
-      <w:r>
-        <w:rPr>
-          <w:rFonts w:ascii="Times New Roman" w:eastAsia="Times New Roman" w:hAnsi="Times New Roman" w:cs="Times New Roman"/>
-          <w:sz w:val="24"/>
-          <w:szCs w:val="24"/>
-          <w:lang w:eastAsia="fr-FR"/>
-        </w:rPr>
-        <w:t>n’analysent</w:t>
-      </w:r>
-      <w:proofErr w:type="gramEnd"/>
-      <w:r>
-        <w:rPr>
-          <w:rFonts w:ascii="Times New Roman" w:eastAsia="Times New Roman" w:hAnsi="Times New Roman" w:cs="Times New Roman"/>
-          <w:sz w:val="24"/>
-          <w:szCs w:val="24"/>
-          <w:lang w:eastAsia="fr-FR"/>
-        </w:rPr>
-        <w:t xml:space="preserve"> pas leurs dépenses</w:t>
+      <w:r>
+        <w:rPr>
+          <w:rFonts w:ascii="Times New Roman" w:eastAsia="Times New Roman" w:hAnsi="Times New Roman" w:cs="Times New Roman"/>
+          <w:sz w:val="24"/>
+          <w:szCs w:val="24"/>
+          <w:lang w:eastAsia="fr-FR"/>
+        </w:rPr>
+        <w:t>n’analysent pas leurs dépenses</w:t>
       </w:r>
     </w:p>
     <w:p>
@@ -576,25 +488,14 @@
           <w:lang w:eastAsia="fr-FR"/>
         </w:rPr>
       </w:pPr>
-      <w:proofErr w:type="gramStart"/>
-      <w:r>
-        <w:rPr>
-          <w:rFonts w:ascii="Times New Roman" w:eastAsia="Times New Roman" w:hAnsi="Times New Roman" w:cs="Times New Roman"/>
-          <w:sz w:val="24"/>
-          <w:szCs w:val="24"/>
-          <w:lang w:eastAsia="fr-FR"/>
-        </w:rPr>
-        <w:t>un</w:t>
-      </w:r>
-      <w:proofErr w:type="gramEnd"/>
-      <w:r>
-        <w:rPr>
-          <w:rFonts w:ascii="Times New Roman" w:eastAsia="Times New Roman" w:hAnsi="Times New Roman" w:cs="Times New Roman"/>
-          <w:sz w:val="24"/>
-          <w:szCs w:val="24"/>
-          <w:lang w:eastAsia="fr-FR"/>
-        </w:rPr>
-        <w:t xml:space="preserve"> suivi clair des finances</w:t>
+      <w:r>
+        <w:rPr>
+          <w:rFonts w:ascii="Times New Roman" w:eastAsia="Times New Roman" w:hAnsi="Times New Roman" w:cs="Times New Roman"/>
+          <w:sz w:val="24"/>
+          <w:szCs w:val="24"/>
+          <w:lang w:eastAsia="fr-FR"/>
+        </w:rPr>
+        <w:t>un suivi clair des finances</w:t>
       </w:r>
     </w:p>
     <w:p>
@@ -611,25 +512,14 @@
           <w:lang w:eastAsia="fr-FR"/>
         </w:rPr>
       </w:pPr>
-      <w:proofErr w:type="gramStart"/>
-      <w:r>
-        <w:rPr>
-          <w:rFonts w:ascii="Times New Roman" w:eastAsia="Times New Roman" w:hAnsi="Times New Roman" w:cs="Times New Roman"/>
-          <w:sz w:val="24"/>
-          <w:szCs w:val="24"/>
-          <w:lang w:eastAsia="fr-FR"/>
-        </w:rPr>
-        <w:t>une</w:t>
-      </w:r>
-      <w:proofErr w:type="gramEnd"/>
-      <w:r>
-        <w:rPr>
-          <w:rFonts w:ascii="Times New Roman" w:eastAsia="Times New Roman" w:hAnsi="Times New Roman" w:cs="Times New Roman"/>
-          <w:sz w:val="24"/>
-          <w:szCs w:val="24"/>
-          <w:lang w:eastAsia="fr-FR"/>
-        </w:rPr>
-        <w:t xml:space="preserve"> meilleure gestion des dépenses</w:t>
+      <w:r>
+        <w:rPr>
+          <w:rFonts w:ascii="Times New Roman" w:eastAsia="Times New Roman" w:hAnsi="Times New Roman" w:cs="Times New Roman"/>
+          <w:sz w:val="24"/>
+          <w:szCs w:val="24"/>
+          <w:lang w:eastAsia="fr-FR"/>
+        </w:rPr>
+        <w:t>une meilleure gestion des dépenses</w:t>
       </w:r>
     </w:p>
     <w:p>
@@ -646,25 +536,14 @@
           <w:lang w:eastAsia="fr-FR"/>
         </w:rPr>
       </w:pPr>
-      <w:proofErr w:type="gramStart"/>
-      <w:r>
-        <w:rPr>
-          <w:rFonts w:ascii="Times New Roman" w:eastAsia="Times New Roman" w:hAnsi="Times New Roman" w:cs="Times New Roman"/>
-          <w:sz w:val="24"/>
-          <w:szCs w:val="24"/>
-          <w:lang w:eastAsia="fr-FR"/>
-        </w:rPr>
-        <w:t>une</w:t>
-      </w:r>
-      <w:proofErr w:type="gramEnd"/>
-      <w:r>
-        <w:rPr>
-          <w:rFonts w:ascii="Times New Roman" w:eastAsia="Times New Roman" w:hAnsi="Times New Roman" w:cs="Times New Roman"/>
-          <w:sz w:val="24"/>
-          <w:szCs w:val="24"/>
-          <w:lang w:eastAsia="fr-FR"/>
-        </w:rPr>
-        <w:t xml:space="preserve"> prise de décision financière</w:t>
+      <w:r>
+        <w:rPr>
+          <w:rFonts w:ascii="Times New Roman" w:eastAsia="Times New Roman" w:hAnsi="Times New Roman" w:cs="Times New Roman"/>
+          <w:sz w:val="24"/>
+          <w:szCs w:val="24"/>
+          <w:lang w:eastAsia="fr-FR"/>
+        </w:rPr>
+        <w:t>une prise de décision financière</w:t>
       </w:r>
     </w:p>
     <w:p>
@@ -2817,7 +2696,6 @@
           <w:lang w:eastAsia="fr-FR"/>
         </w:rPr>
       </w:pPr>
-      <w:proofErr w:type="spellStart"/>
       <w:r>
         <w:rPr>
           <w:rFonts w:ascii="Times New Roman" w:eastAsia="Times New Roman" w:hAnsi="Times New Roman" w:cs="Times New Roman"/>
@@ -2830,7 +2708,6 @@
         <w:lastRenderedPageBreak/>
         <w:t>Multi-comptes</w:t>
       </w:r>
-      <w:proofErr w:type="spellEnd"/>
     </w:p>
     <w:p>
       <w:pPr>
@@ -3057,7 +2934,6 @@
           <w:lang w:eastAsia="fr-FR"/>
         </w:rPr>
       </w:pPr>
-      <w:proofErr w:type="gramStart"/>
       <w:r>
         <w:rPr>
           <w:rFonts w:ascii="Courier New" w:eastAsia="Times New Roman" w:hAnsi="Courier New" w:cs="Courier New"/>
@@ -3065,17 +2941,7 @@
           <w:szCs w:val="20"/>
           <w:lang w:eastAsia="fr-FR"/>
         </w:rPr>
-        <w:t>Frontend  &lt;</w:t>
-      </w:r>
-      <w:proofErr w:type="gramEnd"/>
-      <w:r>
-        <w:rPr>
-          <w:rFonts w:ascii="Courier New" w:eastAsia="Times New Roman" w:hAnsi="Courier New" w:cs="Courier New"/>
-          <w:sz w:val="20"/>
-          <w:szCs w:val="20"/>
-          <w:lang w:eastAsia="fr-FR"/>
-        </w:rPr>
-        <w:t>-----&gt;  Backend  &lt;-----&gt; Base de données</w:t>
+        <w:t>Frontend  &lt;-----&gt;  Backend  &lt;-----&gt; Base de données</w:t>
       </w:r>
     </w:p>
     <w:p>
@@ -3193,7 +3059,6 @@
           <w:lang w:eastAsia="fr-FR"/>
         </w:rPr>
       </w:pPr>
-      <w:proofErr w:type="spellStart"/>
       <w:r>
         <w:rPr>
           <w:rFonts w:ascii="Times New Roman" w:eastAsia="Times New Roman" w:hAnsi="Times New Roman" w:cs="Times New Roman"/>
@@ -3203,7 +3068,6 @@
         </w:rPr>
         <w:t>React</w:t>
       </w:r>
-      <w:proofErr w:type="spellEnd"/>
     </w:p>
     <w:p>
       <w:pPr>
@@ -3243,25 +3107,14 @@
           <w:lang w:eastAsia="fr-FR"/>
         </w:rPr>
       </w:pPr>
-      <w:proofErr w:type="spellStart"/>
-      <w:r>
-        <w:rPr>
-          <w:rFonts w:ascii="Times New Roman" w:eastAsia="Times New Roman" w:hAnsi="Times New Roman" w:cs="Times New Roman"/>
-          <w:sz w:val="24"/>
-          <w:szCs w:val="24"/>
-          <w:lang w:eastAsia="fr-FR"/>
-        </w:rPr>
-        <w:t>Tailwind</w:t>
-      </w:r>
-      <w:proofErr w:type="spellEnd"/>
-      <w:r>
-        <w:rPr>
-          <w:rFonts w:ascii="Times New Roman" w:eastAsia="Times New Roman" w:hAnsi="Times New Roman" w:cs="Times New Roman"/>
-          <w:sz w:val="24"/>
-          <w:szCs w:val="24"/>
-          <w:lang w:eastAsia="fr-FR"/>
-        </w:rPr>
-        <w:t xml:space="preserve"> CSS</w:t>
+      <w:r>
+        <w:rPr>
+          <w:rFonts w:ascii="Times New Roman" w:eastAsia="Times New Roman" w:hAnsi="Times New Roman" w:cs="Times New Roman"/>
+          <w:sz w:val="24"/>
+          <w:szCs w:val="24"/>
+          <w:lang w:eastAsia="fr-FR"/>
+        </w:rPr>
+        <w:t>Tailwind CSS</w:t>
       </w:r>
     </w:p>
     <w:p>
@@ -3376,7 +3229,6 @@
           <w:lang w:eastAsia="fr-FR"/>
         </w:rPr>
       </w:pPr>
-      <w:proofErr w:type="spellStart"/>
       <w:r>
         <w:rPr>
           <w:rFonts w:ascii="Times New Roman" w:eastAsia="Times New Roman" w:hAnsi="Times New Roman" w:cs="Times New Roman"/>
@@ -3386,7 +3238,6 @@
         </w:rPr>
         <w:t>FastAPI</w:t>
       </w:r>
-      <w:proofErr w:type="spellEnd"/>
     </w:p>
     <w:p>
       <w:pPr>
@@ -3496,7 +3347,6 @@
           <w:lang w:eastAsia="fr-FR"/>
         </w:rPr>
       </w:pPr>
-      <w:proofErr w:type="spellStart"/>
       <w:r>
         <w:rPr>
           <w:rFonts w:ascii="Times New Roman" w:eastAsia="Times New Roman" w:hAnsi="Times New Roman" w:cs="Times New Roman"/>
@@ -3506,7 +3356,6 @@
         </w:rPr>
         <w:t>NumPy</w:t>
       </w:r>
-      <w:proofErr w:type="spellEnd"/>
     </w:p>
     <w:p>
       <w:pPr>
@@ -3761,7 +3610,6 @@
           <w:lang w:eastAsia="fr-FR"/>
         </w:rPr>
       </w:pPr>
-      <w:proofErr w:type="spellStart"/>
       <w:r>
         <w:rPr>
           <w:rFonts w:ascii="Times New Roman" w:eastAsia="Times New Roman" w:hAnsi="Times New Roman" w:cs="Times New Roman"/>
@@ -3771,7 +3619,6 @@
         </w:rPr>
         <w:t>Recharts</w:t>
       </w:r>
-      <w:proofErr w:type="spellEnd"/>
     </w:p>
     <w:p>
       <w:pPr>
@@ -3850,7 +3697,6 @@
           <w:lang w:eastAsia="fr-FR"/>
         </w:rPr>
       </w:pPr>
-      <w:proofErr w:type="gramStart"/>
       <w:r>
         <w:rPr>
           <w:rFonts w:ascii="Courier New" w:eastAsia="Times New Roman" w:hAnsi="Courier New" w:cs="Courier New"/>
@@ -3858,17 +3704,7 @@
           <w:szCs w:val="20"/>
           <w:lang w:eastAsia="fr-FR"/>
         </w:rPr>
-        <w:t>budget</w:t>
-      </w:r>
-      <w:proofErr w:type="gramEnd"/>
-      <w:r>
-        <w:rPr>
-          <w:rFonts w:ascii="Courier New" w:eastAsia="Times New Roman" w:hAnsi="Courier New" w:cs="Courier New"/>
-          <w:sz w:val="20"/>
-          <w:szCs w:val="20"/>
-          <w:lang w:eastAsia="fr-FR"/>
-        </w:rPr>
-        <w:t>-manager/</w:t>
+        <w:t>budget-manager/</w:t>
       </w:r>
     </w:p>
     <w:p>
@@ -4058,27 +3894,7 @@
           <w:szCs w:val="20"/>
           <w:lang w:eastAsia="fr-FR"/>
         </w:rPr>
-        <w:t xml:space="preserve">│   │   ├── </w:t>
-      </w:r>
-      <w:proofErr w:type="spellStart"/>
-      <w:r>
-        <w:rPr>
-          <w:rFonts w:ascii="Courier New" w:eastAsia="Times New Roman" w:hAnsi="Courier New" w:cs="Courier New"/>
-          <w:sz w:val="20"/>
-          <w:szCs w:val="20"/>
-          <w:lang w:eastAsia="fr-FR"/>
-        </w:rPr>
-        <w:t>models</w:t>
-      </w:r>
-      <w:proofErr w:type="spellEnd"/>
-      <w:r>
-        <w:rPr>
-          <w:rFonts w:ascii="Courier New" w:eastAsia="Times New Roman" w:hAnsi="Courier New" w:cs="Courier New"/>
-          <w:sz w:val="20"/>
-          <w:szCs w:val="20"/>
-          <w:lang w:eastAsia="fr-FR"/>
-        </w:rPr>
-        <w:t>/</w:t>
+        <w:t>│   │   ├── models/</w:t>
       </w:r>
     </w:p>
     <w:p>
@@ -4154,27 +3970,7 @@
           <w:szCs w:val="20"/>
           <w:lang w:eastAsia="fr-FR"/>
         </w:rPr>
-        <w:t xml:space="preserve">│   │   ├── </w:t>
-      </w:r>
-      <w:proofErr w:type="spellStart"/>
-      <w:r>
-        <w:rPr>
-          <w:rFonts w:ascii="Courier New" w:eastAsia="Times New Roman" w:hAnsi="Courier New" w:cs="Courier New"/>
-          <w:sz w:val="20"/>
-          <w:szCs w:val="20"/>
-          <w:lang w:eastAsia="fr-FR"/>
-        </w:rPr>
-        <w:t>database</w:t>
-      </w:r>
-      <w:proofErr w:type="spellEnd"/>
-      <w:r>
-        <w:rPr>
-          <w:rFonts w:ascii="Courier New" w:eastAsia="Times New Roman" w:hAnsi="Courier New" w:cs="Courier New"/>
-          <w:sz w:val="20"/>
-          <w:szCs w:val="20"/>
-          <w:lang w:eastAsia="fr-FR"/>
-        </w:rPr>
-        <w:t>/</w:t>
+        <w:t>│   │   ├── database/</w:t>
       </w:r>
     </w:p>
     <w:p>
@@ -4816,7 +4612,6 @@
                 <w:lang w:eastAsia="fr-FR"/>
               </w:rPr>
             </w:pPr>
-            <w:proofErr w:type="gramStart"/>
             <w:r>
               <w:rPr>
                 <w:rFonts w:ascii="Times New Roman" w:eastAsia="Times New Roman" w:hAnsi="Times New Roman" w:cs="Times New Roman"/>
@@ -4826,7 +4621,6 @@
               </w:rPr>
               <w:t>id</w:t>
             </w:r>
-            <w:proofErr w:type="gramEnd"/>
           </w:p>
         </w:tc>
         <w:tc>
@@ -4845,8 +4639,6 @@
                 <w:lang w:eastAsia="fr-FR"/>
               </w:rPr>
             </w:pPr>
-            <w:proofErr w:type="spellStart"/>
-            <w:proofErr w:type="gramStart"/>
             <w:r>
               <w:rPr>
                 <w:rFonts w:ascii="Times New Roman" w:eastAsia="Times New Roman" w:hAnsi="Times New Roman" w:cs="Times New Roman"/>
@@ -4856,8 +4648,6 @@
               </w:rPr>
               <w:t>integer</w:t>
             </w:r>
-            <w:proofErr w:type="spellEnd"/>
-            <w:proofErr w:type="gramEnd"/>
           </w:p>
         </w:tc>
       </w:tr>
@@ -4881,7 +4671,6 @@
                 <w:lang w:eastAsia="fr-FR"/>
               </w:rPr>
             </w:pPr>
-            <w:proofErr w:type="gramStart"/>
             <w:r>
               <w:rPr>
                 <w:rFonts w:ascii="Times New Roman" w:eastAsia="Times New Roman" w:hAnsi="Times New Roman" w:cs="Times New Roman"/>
@@ -4891,7 +4680,6 @@
               </w:rPr>
               <w:t>nom</w:t>
             </w:r>
-            <w:proofErr w:type="gramEnd"/>
           </w:p>
         </w:tc>
         <w:tc>
@@ -4910,7 +4698,6 @@
                 <w:lang w:eastAsia="fr-FR"/>
               </w:rPr>
             </w:pPr>
-            <w:proofErr w:type="gramStart"/>
             <w:r>
               <w:rPr>
                 <w:rFonts w:ascii="Times New Roman" w:eastAsia="Times New Roman" w:hAnsi="Times New Roman" w:cs="Times New Roman"/>
@@ -4920,7 +4707,6 @@
               </w:rPr>
               <w:t>varchar</w:t>
             </w:r>
-            <w:proofErr w:type="gramEnd"/>
           </w:p>
         </w:tc>
       </w:tr>
@@ -4944,7 +4730,6 @@
                 <w:lang w:eastAsia="fr-FR"/>
               </w:rPr>
             </w:pPr>
-            <w:proofErr w:type="gramStart"/>
             <w:r>
               <w:rPr>
                 <w:rFonts w:ascii="Times New Roman" w:eastAsia="Times New Roman" w:hAnsi="Times New Roman" w:cs="Times New Roman"/>
@@ -4954,7 +4739,6 @@
               </w:rPr>
               <w:t>email</w:t>
             </w:r>
-            <w:proofErr w:type="gramEnd"/>
           </w:p>
         </w:tc>
         <w:tc>
@@ -4973,7 +4757,6 @@
                 <w:lang w:eastAsia="fr-FR"/>
               </w:rPr>
             </w:pPr>
-            <w:proofErr w:type="gramStart"/>
             <w:r>
               <w:rPr>
                 <w:rFonts w:ascii="Times New Roman" w:eastAsia="Times New Roman" w:hAnsi="Times New Roman" w:cs="Times New Roman"/>
@@ -4983,7 +4766,6 @@
               </w:rPr>
               <w:t>varchar</w:t>
             </w:r>
-            <w:proofErr w:type="gramEnd"/>
           </w:p>
         </w:tc>
       </w:tr>
@@ -5007,8 +4789,6 @@
                 <w:lang w:eastAsia="fr-FR"/>
               </w:rPr>
             </w:pPr>
-            <w:proofErr w:type="spellStart"/>
-            <w:proofErr w:type="gramStart"/>
             <w:r>
               <w:rPr>
                 <w:rFonts w:ascii="Times New Roman" w:eastAsia="Times New Roman" w:hAnsi="Times New Roman" w:cs="Times New Roman"/>
@@ -5018,8 +4798,6 @@
               </w:rPr>
               <w:t>password</w:t>
             </w:r>
-            <w:proofErr w:type="spellEnd"/>
-            <w:proofErr w:type="gramEnd"/>
           </w:p>
         </w:tc>
         <w:tc>
@@ -5038,7 +4816,6 @@
                 <w:lang w:eastAsia="fr-FR"/>
               </w:rPr>
             </w:pPr>
-            <w:proofErr w:type="gramStart"/>
             <w:r>
               <w:rPr>
                 <w:rFonts w:ascii="Times New Roman" w:eastAsia="Times New Roman" w:hAnsi="Times New Roman" w:cs="Times New Roman"/>
@@ -5048,7 +4825,6 @@
               </w:rPr>
               <w:t>varchar</w:t>
             </w:r>
-            <w:proofErr w:type="gramEnd"/>
           </w:p>
         </w:tc>
       </w:tr>
@@ -5208,7 +4984,6 @@
                 <w:lang w:eastAsia="fr-FR"/>
               </w:rPr>
             </w:pPr>
-            <w:proofErr w:type="gramStart"/>
             <w:r>
               <w:rPr>
                 <w:rFonts w:ascii="Times New Roman" w:eastAsia="Times New Roman" w:hAnsi="Times New Roman" w:cs="Times New Roman"/>
@@ -5218,7 +4993,6 @@
               </w:rPr>
               <w:t>id</w:t>
             </w:r>
-            <w:proofErr w:type="gramEnd"/>
           </w:p>
         </w:tc>
         <w:tc>
@@ -5237,8 +5011,6 @@
                 <w:lang w:eastAsia="fr-FR"/>
               </w:rPr>
             </w:pPr>
-            <w:proofErr w:type="spellStart"/>
-            <w:proofErr w:type="gramStart"/>
             <w:r>
               <w:rPr>
                 <w:rFonts w:ascii="Times New Roman" w:eastAsia="Times New Roman" w:hAnsi="Times New Roman" w:cs="Times New Roman"/>
@@ -5248,8 +5020,6 @@
               </w:rPr>
               <w:t>integer</w:t>
             </w:r>
-            <w:proofErr w:type="spellEnd"/>
-            <w:proofErr w:type="gramEnd"/>
           </w:p>
         </w:tc>
       </w:tr>
@@ -5273,7 +5043,6 @@
                 <w:lang w:eastAsia="fr-FR"/>
               </w:rPr>
             </w:pPr>
-            <w:proofErr w:type="gramStart"/>
             <w:r>
               <w:rPr>
                 <w:rFonts w:ascii="Times New Roman" w:eastAsia="Times New Roman" w:hAnsi="Times New Roman" w:cs="Times New Roman"/>
@@ -5283,7 +5052,6 @@
               </w:rPr>
               <w:t>montant</w:t>
             </w:r>
-            <w:proofErr w:type="gramEnd"/>
           </w:p>
         </w:tc>
         <w:tc>
@@ -5302,8 +5070,6 @@
                 <w:lang w:eastAsia="fr-FR"/>
               </w:rPr>
             </w:pPr>
-            <w:proofErr w:type="spellStart"/>
-            <w:proofErr w:type="gramStart"/>
             <w:r>
               <w:rPr>
                 <w:rFonts w:ascii="Times New Roman" w:eastAsia="Times New Roman" w:hAnsi="Times New Roman" w:cs="Times New Roman"/>
@@ -5313,8 +5079,6 @@
               </w:rPr>
               <w:t>float</w:t>
             </w:r>
-            <w:proofErr w:type="spellEnd"/>
-            <w:proofErr w:type="gramEnd"/>
           </w:p>
         </w:tc>
       </w:tr>
@@ -5338,8 +5102,6 @@
                 <w:lang w:eastAsia="fr-FR"/>
               </w:rPr>
             </w:pPr>
-            <w:proofErr w:type="spellStart"/>
-            <w:proofErr w:type="gramStart"/>
             <w:r>
               <w:rPr>
                 <w:rFonts w:ascii="Times New Roman" w:eastAsia="Times New Roman" w:hAnsi="Times New Roman" w:cs="Times New Roman"/>
@@ -5349,8 +5111,6 @@
               </w:rPr>
               <w:t>categorie</w:t>
             </w:r>
-            <w:proofErr w:type="spellEnd"/>
-            <w:proofErr w:type="gramEnd"/>
           </w:p>
         </w:tc>
         <w:tc>
@@ -5369,7 +5129,6 @@
                 <w:lang w:eastAsia="fr-FR"/>
               </w:rPr>
             </w:pPr>
-            <w:proofErr w:type="gramStart"/>
             <w:r>
               <w:rPr>
                 <w:rFonts w:ascii="Times New Roman" w:eastAsia="Times New Roman" w:hAnsi="Times New Roman" w:cs="Times New Roman"/>
@@ -5379,7 +5138,6 @@
               </w:rPr>
               <w:t>varchar</w:t>
             </w:r>
-            <w:proofErr w:type="gramEnd"/>
           </w:p>
         </w:tc>
       </w:tr>
@@ -5403,7 +5161,6 @@
                 <w:lang w:eastAsia="fr-FR"/>
               </w:rPr>
             </w:pPr>
-            <w:proofErr w:type="gramStart"/>
             <w:r>
               <w:rPr>
                 <w:rFonts w:ascii="Times New Roman" w:eastAsia="Times New Roman" w:hAnsi="Times New Roman" w:cs="Times New Roman"/>
@@ -5413,7 +5170,6 @@
               </w:rPr>
               <w:t>date</w:t>
             </w:r>
-            <w:proofErr w:type="gramEnd"/>
           </w:p>
         </w:tc>
         <w:tc>
@@ -5432,7 +5188,6 @@
                 <w:lang w:eastAsia="fr-FR"/>
               </w:rPr>
             </w:pPr>
-            <w:proofErr w:type="gramStart"/>
             <w:r>
               <w:rPr>
                 <w:rFonts w:ascii="Times New Roman" w:eastAsia="Times New Roman" w:hAnsi="Times New Roman" w:cs="Times New Roman"/>
@@ -5442,7 +5197,6 @@
               </w:rPr>
               <w:t>date</w:t>
             </w:r>
-            <w:proofErr w:type="gramEnd"/>
           </w:p>
         </w:tc>
       </w:tr>
@@ -5466,7 +5220,6 @@
                 <w:lang w:eastAsia="fr-FR"/>
               </w:rPr>
             </w:pPr>
-            <w:proofErr w:type="gramStart"/>
             <w:r>
               <w:rPr>
                 <w:rFonts w:ascii="Times New Roman" w:eastAsia="Times New Roman" w:hAnsi="Times New Roman" w:cs="Times New Roman"/>
@@ -5476,7 +5229,6 @@
               </w:rPr>
               <w:t>description</w:t>
             </w:r>
-            <w:proofErr w:type="gramEnd"/>
           </w:p>
         </w:tc>
         <w:tc>
@@ -5495,8 +5247,6 @@
                 <w:lang w:eastAsia="fr-FR"/>
               </w:rPr>
             </w:pPr>
-            <w:proofErr w:type="spellStart"/>
-            <w:proofErr w:type="gramStart"/>
             <w:r>
               <w:rPr>
                 <w:rFonts w:ascii="Times New Roman" w:eastAsia="Times New Roman" w:hAnsi="Times New Roman" w:cs="Times New Roman"/>
@@ -5506,8 +5256,6 @@
               </w:rPr>
               <w:t>text</w:t>
             </w:r>
-            <w:proofErr w:type="spellEnd"/>
-            <w:proofErr w:type="gramEnd"/>
           </w:p>
         </w:tc>
       </w:tr>
@@ -5531,8 +5279,6 @@
                 <w:lang w:eastAsia="fr-FR"/>
               </w:rPr>
             </w:pPr>
-            <w:proofErr w:type="spellStart"/>
-            <w:proofErr w:type="gramStart"/>
             <w:r>
               <w:rPr>
                 <w:rFonts w:ascii="Times New Roman" w:eastAsia="Times New Roman" w:hAnsi="Times New Roman" w:cs="Times New Roman"/>
@@ -5540,19 +5286,8 @@
                 <w:szCs w:val="24"/>
                 <w:lang w:eastAsia="fr-FR"/>
               </w:rPr>
-              <w:t>user</w:t>
+              <w:t>user_id</w:t>
             </w:r>
-            <w:proofErr w:type="gramEnd"/>
-            <w:r>
-              <w:rPr>
-                <w:rFonts w:ascii="Times New Roman" w:eastAsia="Times New Roman" w:hAnsi="Times New Roman" w:cs="Times New Roman"/>
-                <w:sz w:val="24"/>
-                <w:szCs w:val="24"/>
-                <w:lang w:eastAsia="fr-FR"/>
-              </w:rPr>
-              <w:t>_id</w:t>
-            </w:r>
-            <w:proofErr w:type="spellEnd"/>
           </w:p>
         </w:tc>
         <w:tc>
@@ -5571,8 +5306,6 @@
                 <w:lang w:eastAsia="fr-FR"/>
               </w:rPr>
             </w:pPr>
-            <w:proofErr w:type="spellStart"/>
-            <w:proofErr w:type="gramStart"/>
             <w:r>
               <w:rPr>
                 <w:rFonts w:ascii="Times New Roman" w:eastAsia="Times New Roman" w:hAnsi="Times New Roman" w:cs="Times New Roman"/>
@@ -5580,18 +5313,7 @@
                 <w:szCs w:val="24"/>
                 <w:lang w:eastAsia="fr-FR"/>
               </w:rPr>
-              <w:t>foreign</w:t>
-            </w:r>
-            <w:proofErr w:type="spellEnd"/>
-            <w:proofErr w:type="gramEnd"/>
-            <w:r>
-              <w:rPr>
-                <w:rFonts w:ascii="Times New Roman" w:eastAsia="Times New Roman" w:hAnsi="Times New Roman" w:cs="Times New Roman"/>
-                <w:sz w:val="24"/>
-                <w:szCs w:val="24"/>
-                <w:lang w:eastAsia="fr-FR"/>
-              </w:rPr>
-              <w:t xml:space="preserve"> key</w:t>
+              <w:t>foreign key</w:t>
             </w:r>
           </w:p>
         </w:tc>
@@ -5752,7 +5474,6 @@
                 <w:lang w:eastAsia="fr-FR"/>
               </w:rPr>
             </w:pPr>
-            <w:proofErr w:type="gramStart"/>
             <w:r>
               <w:rPr>
                 <w:rFonts w:ascii="Times New Roman" w:eastAsia="Times New Roman" w:hAnsi="Times New Roman" w:cs="Times New Roman"/>
@@ -5762,7 +5483,6 @@
               </w:rPr>
               <w:t>id</w:t>
             </w:r>
-            <w:proofErr w:type="gramEnd"/>
           </w:p>
         </w:tc>
         <w:tc>
@@ -5781,8 +5501,6 @@
                 <w:lang w:eastAsia="fr-FR"/>
               </w:rPr>
             </w:pPr>
-            <w:proofErr w:type="spellStart"/>
-            <w:proofErr w:type="gramStart"/>
             <w:r>
               <w:rPr>
                 <w:rFonts w:ascii="Times New Roman" w:eastAsia="Times New Roman" w:hAnsi="Times New Roman" w:cs="Times New Roman"/>
@@ -5792,8 +5510,6 @@
               </w:rPr>
               <w:t>integer</w:t>
             </w:r>
-            <w:proofErr w:type="spellEnd"/>
-            <w:proofErr w:type="gramEnd"/>
           </w:p>
         </w:tc>
       </w:tr>
@@ -5817,7 +5533,6 @@
                 <w:lang w:eastAsia="fr-FR"/>
               </w:rPr>
             </w:pPr>
-            <w:proofErr w:type="gramStart"/>
             <w:r>
               <w:rPr>
                 <w:rFonts w:ascii="Times New Roman" w:eastAsia="Times New Roman" w:hAnsi="Times New Roman" w:cs="Times New Roman"/>
@@ -5827,7 +5542,6 @@
               </w:rPr>
               <w:t>montant</w:t>
             </w:r>
-            <w:proofErr w:type="gramEnd"/>
           </w:p>
         </w:tc>
         <w:tc>
@@ -5846,8 +5560,6 @@
                 <w:lang w:eastAsia="fr-FR"/>
               </w:rPr>
             </w:pPr>
-            <w:proofErr w:type="spellStart"/>
-            <w:proofErr w:type="gramStart"/>
             <w:r>
               <w:rPr>
                 <w:rFonts w:ascii="Times New Roman" w:eastAsia="Times New Roman" w:hAnsi="Times New Roman" w:cs="Times New Roman"/>
@@ -5857,8 +5569,6 @@
               </w:rPr>
               <w:t>float</w:t>
             </w:r>
-            <w:proofErr w:type="spellEnd"/>
-            <w:proofErr w:type="gramEnd"/>
           </w:p>
         </w:tc>
       </w:tr>
@@ -5882,7 +5592,6 @@
                 <w:lang w:eastAsia="fr-FR"/>
               </w:rPr>
             </w:pPr>
-            <w:proofErr w:type="gramStart"/>
             <w:r>
               <w:rPr>
                 <w:rFonts w:ascii="Times New Roman" w:eastAsia="Times New Roman" w:hAnsi="Times New Roman" w:cs="Times New Roman"/>
@@ -5892,7 +5601,6 @@
               </w:rPr>
               <w:t>source</w:t>
             </w:r>
-            <w:proofErr w:type="gramEnd"/>
           </w:p>
         </w:tc>
         <w:tc>
@@ -5911,7 +5619,6 @@
                 <w:lang w:eastAsia="fr-FR"/>
               </w:rPr>
             </w:pPr>
-            <w:proofErr w:type="gramStart"/>
             <w:r>
               <w:rPr>
                 <w:rFonts w:ascii="Times New Roman" w:eastAsia="Times New Roman" w:hAnsi="Times New Roman" w:cs="Times New Roman"/>
@@ -5921,7 +5628,6 @@
               </w:rPr>
               <w:t>varchar</w:t>
             </w:r>
-            <w:proofErr w:type="gramEnd"/>
           </w:p>
         </w:tc>
       </w:tr>
@@ -5945,7 +5651,6 @@
                 <w:lang w:eastAsia="fr-FR"/>
               </w:rPr>
             </w:pPr>
-            <w:proofErr w:type="gramStart"/>
             <w:r>
               <w:rPr>
                 <w:rFonts w:ascii="Times New Roman" w:eastAsia="Times New Roman" w:hAnsi="Times New Roman" w:cs="Times New Roman"/>
@@ -5955,7 +5660,6 @@
               </w:rPr>
               <w:t>date</w:t>
             </w:r>
-            <w:proofErr w:type="gramEnd"/>
           </w:p>
         </w:tc>
         <w:tc>
@@ -5974,7 +5678,6 @@
                 <w:lang w:eastAsia="fr-FR"/>
               </w:rPr>
             </w:pPr>
-            <w:proofErr w:type="gramStart"/>
             <w:r>
               <w:rPr>
                 <w:rFonts w:ascii="Times New Roman" w:eastAsia="Times New Roman" w:hAnsi="Times New Roman" w:cs="Times New Roman"/>
@@ -5984,7 +5687,6 @@
               </w:rPr>
               <w:t>date</w:t>
             </w:r>
-            <w:proofErr w:type="gramEnd"/>
           </w:p>
         </w:tc>
       </w:tr>
@@ -6008,8 +5710,6 @@
                 <w:lang w:eastAsia="fr-FR"/>
               </w:rPr>
             </w:pPr>
-            <w:proofErr w:type="spellStart"/>
-            <w:proofErr w:type="gramStart"/>
             <w:r>
               <w:rPr>
                 <w:rFonts w:ascii="Times New Roman" w:eastAsia="Times New Roman" w:hAnsi="Times New Roman" w:cs="Times New Roman"/>
@@ -6017,19 +5717,8 @@
                 <w:szCs w:val="24"/>
                 <w:lang w:eastAsia="fr-FR"/>
               </w:rPr>
-              <w:t>user</w:t>
+              <w:t>user_id</w:t>
             </w:r>
-            <w:proofErr w:type="gramEnd"/>
-            <w:r>
-              <w:rPr>
-                <w:rFonts w:ascii="Times New Roman" w:eastAsia="Times New Roman" w:hAnsi="Times New Roman" w:cs="Times New Roman"/>
-                <w:sz w:val="24"/>
-                <w:szCs w:val="24"/>
-                <w:lang w:eastAsia="fr-FR"/>
-              </w:rPr>
-              <w:t>_id</w:t>
-            </w:r>
-            <w:proofErr w:type="spellEnd"/>
           </w:p>
         </w:tc>
         <w:tc>
@@ -6048,8 +5737,6 @@
                 <w:lang w:eastAsia="fr-FR"/>
               </w:rPr>
             </w:pPr>
-            <w:proofErr w:type="spellStart"/>
-            <w:proofErr w:type="gramStart"/>
             <w:r>
               <w:rPr>
                 <w:rFonts w:ascii="Times New Roman" w:eastAsia="Times New Roman" w:hAnsi="Times New Roman" w:cs="Times New Roman"/>
@@ -6057,18 +5744,7 @@
                 <w:szCs w:val="24"/>
                 <w:lang w:eastAsia="fr-FR"/>
               </w:rPr>
-              <w:t>foreign</w:t>
-            </w:r>
-            <w:proofErr w:type="spellEnd"/>
-            <w:proofErr w:type="gramEnd"/>
-            <w:r>
-              <w:rPr>
-                <w:rFonts w:ascii="Times New Roman" w:eastAsia="Times New Roman" w:hAnsi="Times New Roman" w:cs="Times New Roman"/>
-                <w:sz w:val="24"/>
-                <w:szCs w:val="24"/>
-                <w:lang w:eastAsia="fr-FR"/>
-              </w:rPr>
-              <w:t xml:space="preserve"> key</w:t>
+              <w:t>foreign key</w:t>
             </w:r>
           </w:p>
         </w:tc>
@@ -6163,7 +5839,6 @@
           <w:lang w:eastAsia="fr-FR"/>
         </w:rPr>
       </w:pPr>
-      <w:proofErr w:type="spellStart"/>
       <w:r>
         <w:rPr>
           <w:rFonts w:ascii="Times New Roman" w:eastAsia="Times New Roman" w:hAnsi="Times New Roman" w:cs="Times New Roman"/>
@@ -6175,7 +5850,6 @@
         </w:rPr>
         <w:t>Auth</w:t>
       </w:r>
-      <w:proofErr w:type="spellEnd"/>
     </w:p>
     <w:p>
       <w:pPr>
@@ -6212,19 +5886,8 @@
           <w:szCs w:val="20"/>
           <w:lang w:eastAsia="fr-FR"/>
         </w:rPr>
-        <w:t>POST /</w:t>
-      </w:r>
-      <w:proofErr w:type="spellStart"/>
-      <w:r>
-        <w:rPr>
-          <w:rFonts w:ascii="Courier New" w:eastAsia="Times New Roman" w:hAnsi="Courier New" w:cs="Courier New"/>
-          <w:sz w:val="20"/>
-          <w:szCs w:val="20"/>
-          <w:lang w:eastAsia="fr-FR"/>
-        </w:rPr>
-        <w:t>register</w:t>
-      </w:r>
-      <w:proofErr w:type="spellEnd"/>
+        <w:t>POST /register</w:t>
+      </w:r>
     </w:p>
     <w:p>
       <w:pPr>
@@ -6325,19 +5988,8 @@
           <w:szCs w:val="20"/>
           <w:lang w:eastAsia="fr-FR"/>
         </w:rPr>
-        <w:t>GET /</w:t>
-      </w:r>
-      <w:proofErr w:type="spellStart"/>
-      <w:r>
-        <w:rPr>
-          <w:rFonts w:ascii="Courier New" w:eastAsia="Times New Roman" w:hAnsi="Courier New" w:cs="Courier New"/>
-          <w:sz w:val="20"/>
-          <w:szCs w:val="20"/>
-          <w:lang w:eastAsia="fr-FR"/>
-        </w:rPr>
-        <w:t>expenses</w:t>
-      </w:r>
-      <w:proofErr w:type="spellEnd"/>
+        <w:t>GET /expenses</w:t>
+      </w:r>
     </w:p>
     <w:p>
       <w:pPr>
@@ -6374,19 +6026,8 @@
           <w:szCs w:val="20"/>
           <w:lang w:eastAsia="fr-FR"/>
         </w:rPr>
-        <w:t>POST /</w:t>
-      </w:r>
-      <w:proofErr w:type="spellStart"/>
-      <w:r>
-        <w:rPr>
-          <w:rFonts w:ascii="Courier New" w:eastAsia="Times New Roman" w:hAnsi="Courier New" w:cs="Courier New"/>
-          <w:sz w:val="20"/>
-          <w:szCs w:val="20"/>
-          <w:lang w:eastAsia="fr-FR"/>
-        </w:rPr>
-        <w:t>expenses</w:t>
-      </w:r>
-      <w:proofErr w:type="spellEnd"/>
+        <w:t>POST /expenses</w:t>
+      </w:r>
     </w:p>
     <w:p>
       <w:pPr>
@@ -6423,38 +6064,7 @@
           <w:szCs w:val="20"/>
           <w:lang w:eastAsia="fr-FR"/>
         </w:rPr>
-        <w:t>PUT /</w:t>
-      </w:r>
-      <w:proofErr w:type="spellStart"/>
-      <w:r>
-        <w:rPr>
-          <w:rFonts w:ascii="Courier New" w:eastAsia="Times New Roman" w:hAnsi="Courier New" w:cs="Courier New"/>
-          <w:sz w:val="20"/>
-          <w:szCs w:val="20"/>
-          <w:lang w:eastAsia="fr-FR"/>
-        </w:rPr>
-        <w:t>expenses</w:t>
-      </w:r>
-      <w:proofErr w:type="spellEnd"/>
-      <w:proofErr w:type="gramStart"/>
-      <w:r>
-        <w:rPr>
-          <w:rFonts w:ascii="Courier New" w:eastAsia="Times New Roman" w:hAnsi="Courier New" w:cs="Courier New"/>
-          <w:sz w:val="20"/>
-          <w:szCs w:val="20"/>
-          <w:lang w:eastAsia="fr-FR"/>
-        </w:rPr>
-        <w:t>/:</w:t>
-      </w:r>
-      <w:proofErr w:type="gramEnd"/>
-      <w:r>
-        <w:rPr>
-          <w:rFonts w:ascii="Courier New" w:eastAsia="Times New Roman" w:hAnsi="Courier New" w:cs="Courier New"/>
-          <w:sz w:val="20"/>
-          <w:szCs w:val="20"/>
-          <w:lang w:eastAsia="fr-FR"/>
-        </w:rPr>
-        <w:t>id</w:t>
+        <w:t>PUT /expenses/:id</w:t>
       </w:r>
     </w:p>
     <w:p>
@@ -6492,38 +6102,7 @@
           <w:szCs w:val="20"/>
           <w:lang w:eastAsia="fr-FR"/>
         </w:rPr>
-        <w:t>DELETE /</w:t>
-      </w:r>
-      <w:proofErr w:type="spellStart"/>
-      <w:r>
-        <w:rPr>
-          <w:rFonts w:ascii="Courier New" w:eastAsia="Times New Roman" w:hAnsi="Courier New" w:cs="Courier New"/>
-          <w:sz w:val="20"/>
-          <w:szCs w:val="20"/>
-          <w:lang w:eastAsia="fr-FR"/>
-        </w:rPr>
-        <w:t>expenses</w:t>
-      </w:r>
-      <w:proofErr w:type="spellEnd"/>
-      <w:proofErr w:type="gramStart"/>
-      <w:r>
-        <w:rPr>
-          <w:rFonts w:ascii="Courier New" w:eastAsia="Times New Roman" w:hAnsi="Courier New" w:cs="Courier New"/>
-          <w:sz w:val="20"/>
-          <w:szCs w:val="20"/>
-          <w:lang w:eastAsia="fr-FR"/>
-        </w:rPr>
-        <w:t>/:</w:t>
-      </w:r>
-      <w:proofErr w:type="gramEnd"/>
-      <w:r>
-        <w:rPr>
-          <w:rFonts w:ascii="Courier New" w:eastAsia="Times New Roman" w:hAnsi="Courier New" w:cs="Courier New"/>
-          <w:sz w:val="20"/>
-          <w:szCs w:val="20"/>
-          <w:lang w:eastAsia="fr-FR"/>
-        </w:rPr>
-        <w:t>id</w:t>
+        <w:t>DELETE /expenses/:id</w:t>
       </w:r>
     </w:p>
     <w:p>
@@ -6586,19 +6165,8 @@
           <w:szCs w:val="20"/>
           <w:lang w:eastAsia="fr-FR"/>
         </w:rPr>
-        <w:t>GET /</w:t>
-      </w:r>
-      <w:proofErr w:type="spellStart"/>
-      <w:r>
-        <w:rPr>
-          <w:rFonts w:ascii="Courier New" w:eastAsia="Times New Roman" w:hAnsi="Courier New" w:cs="Courier New"/>
-          <w:sz w:val="20"/>
-          <w:szCs w:val="20"/>
-          <w:lang w:eastAsia="fr-FR"/>
-        </w:rPr>
-        <w:t>income</w:t>
-      </w:r>
-      <w:proofErr w:type="spellEnd"/>
+        <w:t>GET /income</w:t>
+      </w:r>
     </w:p>
     <w:p>
       <w:pPr>
@@ -6635,19 +6203,8 @@
           <w:szCs w:val="20"/>
           <w:lang w:eastAsia="fr-FR"/>
         </w:rPr>
-        <w:t>POST /</w:t>
-      </w:r>
-      <w:proofErr w:type="spellStart"/>
-      <w:r>
-        <w:rPr>
-          <w:rFonts w:ascii="Courier New" w:eastAsia="Times New Roman" w:hAnsi="Courier New" w:cs="Courier New"/>
-          <w:sz w:val="20"/>
-          <w:szCs w:val="20"/>
-          <w:lang w:eastAsia="fr-FR"/>
-        </w:rPr>
-        <w:t>income</w:t>
-      </w:r>
-      <w:proofErr w:type="spellEnd"/>
+        <w:t>POST /income</w:t>
+      </w:r>
     </w:p>
     <w:p>
       <w:pPr>
@@ -7034,19 +6591,8 @@
           <w:szCs w:val="24"/>
           <w:lang w:eastAsia="fr-FR"/>
         </w:rPr>
-        <w:t xml:space="preserve">JWT </w:t>
-      </w:r>
-      <w:proofErr w:type="spellStart"/>
-      <w:r>
-        <w:rPr>
-          <w:rFonts w:ascii="Times New Roman" w:eastAsia="Times New Roman" w:hAnsi="Times New Roman" w:cs="Times New Roman"/>
-          <w:sz w:val="24"/>
-          <w:szCs w:val="24"/>
-          <w:lang w:eastAsia="fr-FR"/>
-        </w:rPr>
-        <w:t>Authentication</w:t>
-      </w:r>
-      <w:proofErr w:type="spellEnd"/>
+        <w:t>JWT Authentication</w:t>
+      </w:r>
     </w:p>
     <w:p>
       <w:pPr>
@@ -7783,7 +7329,6 @@
         </w:rPr>
       </w:pPr>
       <w:hyperlink r:id="rId5" w:history="1">
-        <w:proofErr w:type="spellStart"/>
         <w:r>
           <w:rPr>
             <w:rFonts w:ascii="Times New Roman" w:eastAsia="Times New Roman" w:hAnsi="Times New Roman" w:cs="Times New Roman"/>
@@ -7795,7 +7340,6 @@
           </w:rPr>
           <w:t>Vercel</w:t>
         </w:r>
-        <w:proofErr w:type="spellEnd"/>
       </w:hyperlink>
     </w:p>
     <w:p>
@@ -7839,7 +7383,6 @@
         </w:rPr>
       </w:pPr>
       <w:hyperlink r:id="rId6" w:history="1">
-        <w:proofErr w:type="spellStart"/>
         <w:r>
           <w:rPr>
             <w:rFonts w:ascii="Times New Roman" w:eastAsia="Times New Roman" w:hAnsi="Times New Roman" w:cs="Times New Roman"/>
@@ -7851,7 +7394,6 @@
           </w:rPr>
           <w:t>Render</w:t>
         </w:r>
-        <w:proofErr w:type="spellEnd"/>
       </w:hyperlink>
     </w:p>
     <w:p>
@@ -7894,7 +7436,6 @@
         </w:rPr>
       </w:pPr>
       <w:hyperlink r:id="rId7" w:history="1">
-        <w:proofErr w:type="spellStart"/>
         <w:r>
           <w:rPr>
             <w:rFonts w:ascii="Times New Roman" w:eastAsia="Times New Roman" w:hAnsi="Times New Roman" w:cs="Times New Roman"/>
@@ -7906,7 +7447,6 @@
           </w:rPr>
           <w:t>Supabase</w:t>
         </w:r>
-        <w:proofErr w:type="spellEnd"/>
       </w:hyperlink>
     </w:p>
     <w:p>
@@ -8094,7 +7634,6 @@
           <w:lang w:eastAsia="fr-FR"/>
         </w:rPr>
       </w:pPr>
-      <w:proofErr w:type="spellStart"/>
       <w:r>
         <w:rPr>
           <w:rFonts w:ascii="Times New Roman" w:eastAsia="Times New Roman" w:hAnsi="Times New Roman" w:cs="Times New Roman"/>
@@ -8104,7 +7643,6 @@
         </w:rPr>
         <w:t>React</w:t>
       </w:r>
-      <w:proofErr w:type="spellEnd"/>
     </w:p>
     <w:p>
       <w:pPr>
@@ -8241,7 +7779,6 @@
           <w:lang w:eastAsia="fr-FR"/>
         </w:rPr>
       </w:pPr>
-      <w:proofErr w:type="spellStart"/>
       <w:r>
         <w:rPr>
           <w:rFonts w:ascii="Times New Roman" w:eastAsia="Times New Roman" w:hAnsi="Times New Roman" w:cs="Times New Roman"/>
@@ -8251,7 +7788,6 @@
         </w:rPr>
         <w:t>NumPy</w:t>
       </w:r>
-      <w:proofErr w:type="spellEnd"/>
     </w:p>
     <w:p>
       <w:pPr>
@@ -8438,22 +7974,8 @@
           <w:szCs w:val="48"/>
           <w:lang w:eastAsia="fr-FR"/>
         </w:rPr>
-        <w:t xml:space="preserve">TABLE </w:t>
-      </w:r>
-      <w:proofErr w:type="spellStart"/>
-      <w:r>
-        <w:rPr>
-          <w:rFonts w:ascii="Times New Roman" w:eastAsia="Times New Roman" w:hAnsi="Times New Roman" w:cs="Times New Roman"/>
-          <w:b/>
-          <w:bCs/>
-          <w:kern w:val="36"/>
-          <w:sz w:val="48"/>
-          <w:szCs w:val="48"/>
-          <w:lang w:eastAsia="fr-FR"/>
-        </w:rPr>
-        <w:t>users</w:t>
-      </w:r>
-      <w:proofErr w:type="spellEnd"/>
+        <w:t>TABLE users</w:t>
+      </w:r>
     </w:p>
     <w:p>
       <w:pPr>
@@ -8582,7 +8104,6 @@
                 <w:lang w:eastAsia="fr-FR"/>
               </w:rPr>
             </w:pPr>
-            <w:proofErr w:type="gramStart"/>
             <w:r>
               <w:rPr>
                 <w:rFonts w:ascii="Times New Roman" w:eastAsia="Times New Roman" w:hAnsi="Times New Roman" w:cs="Times New Roman"/>
@@ -8592,7 +8113,6 @@
               </w:rPr>
               <w:t>id</w:t>
             </w:r>
-            <w:proofErr w:type="gramEnd"/>
           </w:p>
         </w:tc>
         <w:tc>
@@ -8643,8 +8163,6 @@
                 <w:lang w:eastAsia="fr-FR"/>
               </w:rPr>
             </w:pPr>
-            <w:proofErr w:type="spellStart"/>
-            <w:proofErr w:type="gramStart"/>
             <w:r>
               <w:rPr>
                 <w:rFonts w:ascii="Times New Roman" w:eastAsia="Times New Roman" w:hAnsi="Times New Roman" w:cs="Times New Roman"/>
@@ -8654,8 +8172,6 @@
               </w:rPr>
               <w:t>fullname</w:t>
             </w:r>
-            <w:proofErr w:type="spellEnd"/>
-            <w:proofErr w:type="gramEnd"/>
           </w:p>
         </w:tc>
         <w:tc>
@@ -8674,7 +8190,6 @@
                 <w:lang w:eastAsia="fr-FR"/>
               </w:rPr>
             </w:pPr>
-            <w:proofErr w:type="gramStart"/>
             <w:r>
               <w:rPr>
                 <w:rFonts w:ascii="Times New Roman" w:eastAsia="Times New Roman" w:hAnsi="Times New Roman" w:cs="Times New Roman"/>
@@ -8682,17 +8197,7 @@
                 <w:szCs w:val="24"/>
                 <w:lang w:eastAsia="fr-FR"/>
               </w:rPr>
-              <w:t>VARCHAR(</w:t>
-            </w:r>
-            <w:proofErr w:type="gramEnd"/>
-            <w:r>
-              <w:rPr>
-                <w:rFonts w:ascii="Times New Roman" w:eastAsia="Times New Roman" w:hAnsi="Times New Roman" w:cs="Times New Roman"/>
-                <w:sz w:val="24"/>
-                <w:szCs w:val="24"/>
-                <w:lang w:eastAsia="fr-FR"/>
-              </w:rPr>
-              <w:t>100)</w:t>
+              <w:t>VARCHAR(100)</w:t>
             </w:r>
           </w:p>
         </w:tc>
@@ -8717,7 +8222,6 @@
                 <w:lang w:eastAsia="fr-FR"/>
               </w:rPr>
             </w:pPr>
-            <w:proofErr w:type="gramStart"/>
             <w:r>
               <w:rPr>
                 <w:rFonts w:ascii="Times New Roman" w:eastAsia="Times New Roman" w:hAnsi="Times New Roman" w:cs="Times New Roman"/>
@@ -8727,7 +8231,6 @@
               </w:rPr>
               <w:t>email</w:t>
             </w:r>
-            <w:proofErr w:type="gramEnd"/>
           </w:p>
         </w:tc>
         <w:tc>
@@ -8746,7 +8249,6 @@
                 <w:lang w:eastAsia="fr-FR"/>
               </w:rPr>
             </w:pPr>
-            <w:proofErr w:type="gramStart"/>
             <w:r>
               <w:rPr>
                 <w:rFonts w:ascii="Times New Roman" w:eastAsia="Times New Roman" w:hAnsi="Times New Roman" w:cs="Times New Roman"/>
@@ -8754,17 +8256,7 @@
                 <w:szCs w:val="24"/>
                 <w:lang w:eastAsia="fr-FR"/>
               </w:rPr>
-              <w:t>VARCHAR(</w:t>
-            </w:r>
-            <w:proofErr w:type="gramEnd"/>
-            <w:r>
-              <w:rPr>
-                <w:rFonts w:ascii="Times New Roman" w:eastAsia="Times New Roman" w:hAnsi="Times New Roman" w:cs="Times New Roman"/>
-                <w:sz w:val="24"/>
-                <w:szCs w:val="24"/>
-                <w:lang w:eastAsia="fr-FR"/>
-              </w:rPr>
-              <w:t>150)</w:t>
+              <w:t>VARCHAR(150)</w:t>
             </w:r>
           </w:p>
         </w:tc>
@@ -8789,8 +8281,6 @@
                 <w:lang w:eastAsia="fr-FR"/>
               </w:rPr>
             </w:pPr>
-            <w:proofErr w:type="spellStart"/>
-            <w:proofErr w:type="gramStart"/>
             <w:r>
               <w:rPr>
                 <w:rFonts w:ascii="Times New Roman" w:eastAsia="Times New Roman" w:hAnsi="Times New Roman" w:cs="Times New Roman"/>
@@ -8800,8 +8290,6 @@
               </w:rPr>
               <w:t>password</w:t>
             </w:r>
-            <w:proofErr w:type="spellEnd"/>
-            <w:proofErr w:type="gramEnd"/>
           </w:p>
         </w:tc>
         <w:tc>
@@ -8820,7 +8308,6 @@
                 <w:lang w:eastAsia="fr-FR"/>
               </w:rPr>
             </w:pPr>
-            <w:proofErr w:type="gramStart"/>
             <w:r>
               <w:rPr>
                 <w:rFonts w:ascii="Times New Roman" w:eastAsia="Times New Roman" w:hAnsi="Times New Roman" w:cs="Times New Roman"/>
@@ -8828,17 +8315,7 @@
                 <w:szCs w:val="24"/>
                 <w:lang w:eastAsia="fr-FR"/>
               </w:rPr>
-              <w:t>VARCHAR(</w:t>
-            </w:r>
-            <w:proofErr w:type="gramEnd"/>
-            <w:r>
-              <w:rPr>
-                <w:rFonts w:ascii="Times New Roman" w:eastAsia="Times New Roman" w:hAnsi="Times New Roman" w:cs="Times New Roman"/>
-                <w:sz w:val="24"/>
-                <w:szCs w:val="24"/>
-                <w:lang w:eastAsia="fr-FR"/>
-              </w:rPr>
-              <w:t>255)</w:t>
+              <w:t>VARCHAR(255)</w:t>
             </w:r>
           </w:p>
         </w:tc>
@@ -8863,8 +8340,6 @@
                 <w:lang w:eastAsia="fr-FR"/>
               </w:rPr>
             </w:pPr>
-            <w:proofErr w:type="spellStart"/>
-            <w:proofErr w:type="gramStart"/>
             <w:r>
               <w:rPr>
                 <w:rFonts w:ascii="Times New Roman" w:eastAsia="Times New Roman" w:hAnsi="Times New Roman" w:cs="Times New Roman"/>
@@ -8874,8 +8349,6 @@
               </w:rPr>
               <w:t>currency</w:t>
             </w:r>
-            <w:proofErr w:type="spellEnd"/>
-            <w:proofErr w:type="gramEnd"/>
           </w:p>
         </w:tc>
         <w:tc>
@@ -8894,7 +8367,6 @@
                 <w:lang w:eastAsia="fr-FR"/>
               </w:rPr>
             </w:pPr>
-            <w:proofErr w:type="gramStart"/>
             <w:r>
               <w:rPr>
                 <w:rFonts w:ascii="Times New Roman" w:eastAsia="Times New Roman" w:hAnsi="Times New Roman" w:cs="Times New Roman"/>
@@ -8902,17 +8374,7 @@
                 <w:szCs w:val="24"/>
                 <w:lang w:eastAsia="fr-FR"/>
               </w:rPr>
-              <w:t>VARCHAR(</w:t>
-            </w:r>
-            <w:proofErr w:type="gramEnd"/>
-            <w:r>
-              <w:rPr>
-                <w:rFonts w:ascii="Times New Roman" w:eastAsia="Times New Roman" w:hAnsi="Times New Roman" w:cs="Times New Roman"/>
-                <w:sz w:val="24"/>
-                <w:szCs w:val="24"/>
-                <w:lang w:eastAsia="fr-FR"/>
-              </w:rPr>
-              <w:t>10)</w:t>
+              <w:t>VARCHAR(10)</w:t>
             </w:r>
           </w:p>
         </w:tc>
@@ -8937,8 +8399,6 @@
                 <w:lang w:eastAsia="fr-FR"/>
               </w:rPr>
             </w:pPr>
-            <w:proofErr w:type="spellStart"/>
-            <w:proofErr w:type="gramStart"/>
             <w:r>
               <w:rPr>
                 <w:rFonts w:ascii="Times New Roman" w:eastAsia="Times New Roman" w:hAnsi="Times New Roman" w:cs="Times New Roman"/>
@@ -8946,19 +8406,8 @@
                 <w:szCs w:val="24"/>
                 <w:lang w:eastAsia="fr-FR"/>
               </w:rPr>
-              <w:t>created</w:t>
+              <w:t>created_at</w:t>
             </w:r>
-            <w:proofErr w:type="gramEnd"/>
-            <w:r>
-              <w:rPr>
-                <w:rFonts w:ascii="Times New Roman" w:eastAsia="Times New Roman" w:hAnsi="Times New Roman" w:cs="Times New Roman"/>
-                <w:sz w:val="24"/>
-                <w:szCs w:val="24"/>
-                <w:lang w:eastAsia="fr-FR"/>
-              </w:rPr>
-              <w:t>_at</w:t>
-            </w:r>
-            <w:proofErr w:type="spellEnd"/>
           </w:p>
         </w:tc>
         <w:tc>
@@ -9009,8 +8458,6 @@
                 <w:lang w:eastAsia="fr-FR"/>
               </w:rPr>
             </w:pPr>
-            <w:proofErr w:type="spellStart"/>
-            <w:proofErr w:type="gramStart"/>
             <w:r>
               <w:rPr>
                 <w:rFonts w:ascii="Times New Roman" w:eastAsia="Times New Roman" w:hAnsi="Times New Roman" w:cs="Times New Roman"/>
@@ -9018,19 +8465,8 @@
                 <w:szCs w:val="24"/>
                 <w:lang w:eastAsia="fr-FR"/>
               </w:rPr>
-              <w:t>updated</w:t>
+              <w:t>updated_at</w:t>
             </w:r>
-            <w:proofErr w:type="gramEnd"/>
-            <w:r>
-              <w:rPr>
-                <w:rFonts w:ascii="Times New Roman" w:eastAsia="Times New Roman" w:hAnsi="Times New Roman" w:cs="Times New Roman"/>
-                <w:sz w:val="24"/>
-                <w:szCs w:val="24"/>
-                <w:lang w:eastAsia="fr-FR"/>
-              </w:rPr>
-              <w:t>_at</w:t>
-            </w:r>
-            <w:proofErr w:type="spellEnd"/>
           </w:p>
         </w:tc>
         <w:tc>
@@ -9108,22 +8544,8 @@
           <w:szCs w:val="48"/>
           <w:lang w:eastAsia="fr-FR"/>
         </w:rPr>
-        <w:t xml:space="preserve">TABLE </w:t>
-      </w:r>
-      <w:proofErr w:type="spellStart"/>
-      <w:r>
-        <w:rPr>
-          <w:rFonts w:ascii="Times New Roman" w:eastAsia="Times New Roman" w:hAnsi="Times New Roman" w:cs="Times New Roman"/>
-          <w:b/>
-          <w:bCs/>
-          <w:kern w:val="36"/>
-          <w:sz w:val="48"/>
-          <w:szCs w:val="48"/>
-          <w:lang w:eastAsia="fr-FR"/>
-        </w:rPr>
-        <w:t>accounts</w:t>
-      </w:r>
-      <w:proofErr w:type="spellEnd"/>
+        <w:t>TABLE accounts</w:t>
+      </w:r>
     </w:p>
     <w:p>
       <w:pPr>
@@ -9372,7 +8794,6 @@
                 <w:lang w:eastAsia="fr-FR"/>
               </w:rPr>
             </w:pPr>
-            <w:proofErr w:type="gramStart"/>
             <w:r>
               <w:rPr>
                 <w:rFonts w:ascii="Times New Roman" w:eastAsia="Times New Roman" w:hAnsi="Times New Roman" w:cs="Times New Roman"/>
@@ -9382,7 +8803,6 @@
               </w:rPr>
               <w:t>id</w:t>
             </w:r>
-            <w:proofErr w:type="gramEnd"/>
           </w:p>
         </w:tc>
         <w:tc>
@@ -9433,8 +8853,6 @@
                 <w:lang w:eastAsia="fr-FR"/>
               </w:rPr>
             </w:pPr>
-            <w:proofErr w:type="spellStart"/>
-            <w:proofErr w:type="gramStart"/>
             <w:r>
               <w:rPr>
                 <w:rFonts w:ascii="Times New Roman" w:eastAsia="Times New Roman" w:hAnsi="Times New Roman" w:cs="Times New Roman"/>
@@ -9444,8 +8862,6 @@
               </w:rPr>
               <w:t>name</w:t>
             </w:r>
-            <w:proofErr w:type="spellEnd"/>
-            <w:proofErr w:type="gramEnd"/>
           </w:p>
         </w:tc>
         <w:tc>
@@ -9464,7 +8880,6 @@
                 <w:lang w:eastAsia="fr-FR"/>
               </w:rPr>
             </w:pPr>
-            <w:proofErr w:type="gramStart"/>
             <w:r>
               <w:rPr>
                 <w:rFonts w:ascii="Times New Roman" w:eastAsia="Times New Roman" w:hAnsi="Times New Roman" w:cs="Times New Roman"/>
@@ -9472,17 +8887,7 @@
                 <w:szCs w:val="24"/>
                 <w:lang w:eastAsia="fr-FR"/>
               </w:rPr>
-              <w:t>VARCHAR(</w:t>
-            </w:r>
-            <w:proofErr w:type="gramEnd"/>
-            <w:r>
-              <w:rPr>
-                <w:rFonts w:ascii="Times New Roman" w:eastAsia="Times New Roman" w:hAnsi="Times New Roman" w:cs="Times New Roman"/>
-                <w:sz w:val="24"/>
-                <w:szCs w:val="24"/>
-                <w:lang w:eastAsia="fr-FR"/>
-              </w:rPr>
-              <w:t>100)</w:t>
+              <w:t>VARCHAR(100)</w:t>
             </w:r>
           </w:p>
         </w:tc>
@@ -9507,7 +8912,6 @@
                 <w:lang w:eastAsia="fr-FR"/>
               </w:rPr>
             </w:pPr>
-            <w:proofErr w:type="gramStart"/>
             <w:r>
               <w:rPr>
                 <w:rFonts w:ascii="Times New Roman" w:eastAsia="Times New Roman" w:hAnsi="Times New Roman" w:cs="Times New Roman"/>
@@ -9517,7 +8921,6 @@
               </w:rPr>
               <w:t>balance</w:t>
             </w:r>
-            <w:proofErr w:type="gramEnd"/>
           </w:p>
         </w:tc>
         <w:tc>
@@ -9536,7 +8939,6 @@
                 <w:lang w:eastAsia="fr-FR"/>
               </w:rPr>
             </w:pPr>
-            <w:proofErr w:type="gramStart"/>
             <w:r>
               <w:rPr>
                 <w:rFonts w:ascii="Times New Roman" w:eastAsia="Times New Roman" w:hAnsi="Times New Roman" w:cs="Times New Roman"/>
@@ -9544,17 +8946,7 @@
                 <w:szCs w:val="24"/>
                 <w:lang w:eastAsia="fr-FR"/>
               </w:rPr>
-              <w:t>DECIMAL(</w:t>
-            </w:r>
-            <w:proofErr w:type="gramEnd"/>
-            <w:r>
-              <w:rPr>
-                <w:rFonts w:ascii="Times New Roman" w:eastAsia="Times New Roman" w:hAnsi="Times New Roman" w:cs="Times New Roman"/>
-                <w:sz w:val="24"/>
-                <w:szCs w:val="24"/>
-                <w:lang w:eastAsia="fr-FR"/>
-              </w:rPr>
-              <w:t>12,2)</w:t>
+              <w:t>DECIMAL(12,2)</w:t>
             </w:r>
           </w:p>
         </w:tc>
@@ -9579,7 +8971,6 @@
                 <w:lang w:eastAsia="fr-FR"/>
               </w:rPr>
             </w:pPr>
-            <w:proofErr w:type="gramStart"/>
             <w:r>
               <w:rPr>
                 <w:rFonts w:ascii="Times New Roman" w:eastAsia="Times New Roman" w:hAnsi="Times New Roman" w:cs="Times New Roman"/>
@@ -9589,7 +8980,6 @@
               </w:rPr>
               <w:t>type</w:t>
             </w:r>
-            <w:proofErr w:type="gramEnd"/>
           </w:p>
         </w:tc>
         <w:tc>
@@ -9608,7 +8998,6 @@
                 <w:lang w:eastAsia="fr-FR"/>
               </w:rPr>
             </w:pPr>
-            <w:proofErr w:type="gramStart"/>
             <w:r>
               <w:rPr>
                 <w:rFonts w:ascii="Times New Roman" w:eastAsia="Times New Roman" w:hAnsi="Times New Roman" w:cs="Times New Roman"/>
@@ -9616,17 +9005,7 @@
                 <w:szCs w:val="24"/>
                 <w:lang w:eastAsia="fr-FR"/>
               </w:rPr>
-              <w:t>VARCHAR(</w:t>
-            </w:r>
-            <w:proofErr w:type="gramEnd"/>
-            <w:r>
-              <w:rPr>
-                <w:rFonts w:ascii="Times New Roman" w:eastAsia="Times New Roman" w:hAnsi="Times New Roman" w:cs="Times New Roman"/>
-                <w:sz w:val="24"/>
-                <w:szCs w:val="24"/>
-                <w:lang w:eastAsia="fr-FR"/>
-              </w:rPr>
-              <w:t>50)</w:t>
+              <w:t>VARCHAR(50)</w:t>
             </w:r>
           </w:p>
         </w:tc>
@@ -9651,8 +9030,6 @@
                 <w:lang w:eastAsia="fr-FR"/>
               </w:rPr>
             </w:pPr>
-            <w:proofErr w:type="spellStart"/>
-            <w:proofErr w:type="gramStart"/>
             <w:r>
               <w:rPr>
                 <w:rFonts w:ascii="Times New Roman" w:eastAsia="Times New Roman" w:hAnsi="Times New Roman" w:cs="Times New Roman"/>
@@ -9660,19 +9037,8 @@
                 <w:szCs w:val="24"/>
                 <w:lang w:eastAsia="fr-FR"/>
               </w:rPr>
-              <w:t>user</w:t>
+              <w:t>user_id</w:t>
             </w:r>
-            <w:proofErr w:type="gramEnd"/>
-            <w:r>
-              <w:rPr>
-                <w:rFonts w:ascii="Times New Roman" w:eastAsia="Times New Roman" w:hAnsi="Times New Roman" w:cs="Times New Roman"/>
-                <w:sz w:val="24"/>
-                <w:szCs w:val="24"/>
-                <w:lang w:eastAsia="fr-FR"/>
-              </w:rPr>
-              <w:t>_id</w:t>
-            </w:r>
-            <w:proofErr w:type="spellEnd"/>
           </w:p>
         </w:tc>
         <w:tc>
@@ -9723,8 +9089,6 @@
                 <w:lang w:eastAsia="fr-FR"/>
               </w:rPr>
             </w:pPr>
-            <w:proofErr w:type="spellStart"/>
-            <w:proofErr w:type="gramStart"/>
             <w:r>
               <w:rPr>
                 <w:rFonts w:ascii="Times New Roman" w:eastAsia="Times New Roman" w:hAnsi="Times New Roman" w:cs="Times New Roman"/>
@@ -9732,19 +9096,8 @@
                 <w:szCs w:val="24"/>
                 <w:lang w:eastAsia="fr-FR"/>
               </w:rPr>
-              <w:t>created</w:t>
+              <w:t>created_at</w:t>
             </w:r>
-            <w:proofErr w:type="gramEnd"/>
-            <w:r>
-              <w:rPr>
-                <w:rFonts w:ascii="Times New Roman" w:eastAsia="Times New Roman" w:hAnsi="Times New Roman" w:cs="Times New Roman"/>
-                <w:sz w:val="24"/>
-                <w:szCs w:val="24"/>
-                <w:lang w:eastAsia="fr-FR"/>
-              </w:rPr>
-              <w:t>_at</w:t>
-            </w:r>
-            <w:proofErr w:type="spellEnd"/>
           </w:p>
         </w:tc>
         <w:tc>
@@ -9822,22 +9175,8 @@
           <w:szCs w:val="48"/>
           <w:lang w:eastAsia="fr-FR"/>
         </w:rPr>
-        <w:t xml:space="preserve">TABLE </w:t>
-      </w:r>
-      <w:proofErr w:type="spellStart"/>
-      <w:r>
-        <w:rPr>
-          <w:rFonts w:ascii="Times New Roman" w:eastAsia="Times New Roman" w:hAnsi="Times New Roman" w:cs="Times New Roman"/>
-          <w:b/>
-          <w:bCs/>
-          <w:kern w:val="36"/>
-          <w:sz w:val="48"/>
-          <w:szCs w:val="48"/>
-          <w:lang w:eastAsia="fr-FR"/>
-        </w:rPr>
-        <w:t>categories</w:t>
-      </w:r>
-      <w:proofErr w:type="spellEnd"/>
+        <w:t>TABLE categories</w:t>
+      </w:r>
     </w:p>
     <w:p>
       <w:pPr>
@@ -9965,7 +9304,6 @@
                 <w:lang w:eastAsia="fr-FR"/>
               </w:rPr>
             </w:pPr>
-            <w:proofErr w:type="gramStart"/>
             <w:r>
               <w:rPr>
                 <w:rFonts w:ascii="Times New Roman" w:eastAsia="Times New Roman" w:hAnsi="Times New Roman" w:cs="Times New Roman"/>
@@ -9975,7 +9313,6 @@
               </w:rPr>
               <w:t>id</w:t>
             </w:r>
-            <w:proofErr w:type="gramEnd"/>
           </w:p>
         </w:tc>
         <w:tc>
@@ -10026,8 +9363,6 @@
                 <w:lang w:eastAsia="fr-FR"/>
               </w:rPr>
             </w:pPr>
-            <w:proofErr w:type="spellStart"/>
-            <w:proofErr w:type="gramStart"/>
             <w:r>
               <w:rPr>
                 <w:rFonts w:ascii="Times New Roman" w:eastAsia="Times New Roman" w:hAnsi="Times New Roman" w:cs="Times New Roman"/>
@@ -10037,8 +9372,6 @@
               </w:rPr>
               <w:t>name</w:t>
             </w:r>
-            <w:proofErr w:type="spellEnd"/>
-            <w:proofErr w:type="gramEnd"/>
           </w:p>
         </w:tc>
         <w:tc>
@@ -10057,7 +9390,6 @@
                 <w:lang w:eastAsia="fr-FR"/>
               </w:rPr>
             </w:pPr>
-            <w:proofErr w:type="gramStart"/>
             <w:r>
               <w:rPr>
                 <w:rFonts w:ascii="Times New Roman" w:eastAsia="Times New Roman" w:hAnsi="Times New Roman" w:cs="Times New Roman"/>
@@ -10065,17 +9397,7 @@
                 <w:szCs w:val="24"/>
                 <w:lang w:eastAsia="fr-FR"/>
               </w:rPr>
-              <w:t>VARCHAR(</w:t>
-            </w:r>
-            <w:proofErr w:type="gramEnd"/>
-            <w:r>
-              <w:rPr>
-                <w:rFonts w:ascii="Times New Roman" w:eastAsia="Times New Roman" w:hAnsi="Times New Roman" w:cs="Times New Roman"/>
-                <w:sz w:val="24"/>
-                <w:szCs w:val="24"/>
-                <w:lang w:eastAsia="fr-FR"/>
-              </w:rPr>
-              <w:t>100)</w:t>
+              <w:t>VARCHAR(100)</w:t>
             </w:r>
           </w:p>
         </w:tc>
@@ -10100,8 +9422,6 @@
                 <w:lang w:eastAsia="fr-FR"/>
               </w:rPr>
             </w:pPr>
-            <w:proofErr w:type="spellStart"/>
-            <w:proofErr w:type="gramStart"/>
             <w:r>
               <w:rPr>
                 <w:rFonts w:ascii="Times New Roman" w:eastAsia="Times New Roman" w:hAnsi="Times New Roman" w:cs="Times New Roman"/>
@@ -10111,8 +9431,6 @@
               </w:rPr>
               <w:t>icon</w:t>
             </w:r>
-            <w:proofErr w:type="spellEnd"/>
-            <w:proofErr w:type="gramEnd"/>
           </w:p>
         </w:tc>
         <w:tc>
@@ -10131,7 +9449,6 @@
                 <w:lang w:eastAsia="fr-FR"/>
               </w:rPr>
             </w:pPr>
-            <w:proofErr w:type="gramStart"/>
             <w:r>
               <w:rPr>
                 <w:rFonts w:ascii="Times New Roman" w:eastAsia="Times New Roman" w:hAnsi="Times New Roman" w:cs="Times New Roman"/>
@@ -10139,17 +9456,7 @@
                 <w:szCs w:val="24"/>
                 <w:lang w:eastAsia="fr-FR"/>
               </w:rPr>
-              <w:t>VARCHAR(</w:t>
-            </w:r>
-            <w:proofErr w:type="gramEnd"/>
-            <w:r>
-              <w:rPr>
-                <w:rFonts w:ascii="Times New Roman" w:eastAsia="Times New Roman" w:hAnsi="Times New Roman" w:cs="Times New Roman"/>
-                <w:sz w:val="24"/>
-                <w:szCs w:val="24"/>
-                <w:lang w:eastAsia="fr-FR"/>
-              </w:rPr>
-              <w:t>50)</w:t>
+              <w:t>VARCHAR(50)</w:t>
             </w:r>
           </w:p>
         </w:tc>
@@ -10174,8 +9481,6 @@
                 <w:lang w:eastAsia="fr-FR"/>
               </w:rPr>
             </w:pPr>
-            <w:proofErr w:type="spellStart"/>
-            <w:proofErr w:type="gramStart"/>
             <w:r>
               <w:rPr>
                 <w:rFonts w:ascii="Times New Roman" w:eastAsia="Times New Roman" w:hAnsi="Times New Roman" w:cs="Times New Roman"/>
@@ -10185,8 +9490,6 @@
               </w:rPr>
               <w:t>color</w:t>
             </w:r>
-            <w:proofErr w:type="spellEnd"/>
-            <w:proofErr w:type="gramEnd"/>
           </w:p>
         </w:tc>
         <w:tc>
@@ -10205,7 +9508,6 @@
                 <w:lang w:eastAsia="fr-FR"/>
               </w:rPr>
             </w:pPr>
-            <w:proofErr w:type="gramStart"/>
             <w:r>
               <w:rPr>
                 <w:rFonts w:ascii="Times New Roman" w:eastAsia="Times New Roman" w:hAnsi="Times New Roman" w:cs="Times New Roman"/>
@@ -10213,17 +9515,7 @@
                 <w:szCs w:val="24"/>
                 <w:lang w:eastAsia="fr-FR"/>
               </w:rPr>
-              <w:t>VARCHAR(</w:t>
-            </w:r>
-            <w:proofErr w:type="gramEnd"/>
-            <w:r>
-              <w:rPr>
-                <w:rFonts w:ascii="Times New Roman" w:eastAsia="Times New Roman" w:hAnsi="Times New Roman" w:cs="Times New Roman"/>
-                <w:sz w:val="24"/>
-                <w:szCs w:val="24"/>
-                <w:lang w:eastAsia="fr-FR"/>
-              </w:rPr>
-              <w:t>20)</w:t>
+              <w:t>VARCHAR(20)</w:t>
             </w:r>
           </w:p>
         </w:tc>
@@ -10248,8 +9540,6 @@
                 <w:lang w:eastAsia="fr-FR"/>
               </w:rPr>
             </w:pPr>
-            <w:proofErr w:type="spellStart"/>
-            <w:proofErr w:type="gramStart"/>
             <w:r>
               <w:rPr>
                 <w:rFonts w:ascii="Times New Roman" w:eastAsia="Times New Roman" w:hAnsi="Times New Roman" w:cs="Times New Roman"/>
@@ -10257,19 +9547,8 @@
                 <w:szCs w:val="24"/>
                 <w:lang w:eastAsia="fr-FR"/>
               </w:rPr>
-              <w:t>user</w:t>
+              <w:t>user_id</w:t>
             </w:r>
-            <w:proofErr w:type="gramEnd"/>
-            <w:r>
-              <w:rPr>
-                <w:rFonts w:ascii="Times New Roman" w:eastAsia="Times New Roman" w:hAnsi="Times New Roman" w:cs="Times New Roman"/>
-                <w:sz w:val="24"/>
-                <w:szCs w:val="24"/>
-                <w:lang w:eastAsia="fr-FR"/>
-              </w:rPr>
-              <w:t>_id</w:t>
-            </w:r>
-            <w:proofErr w:type="spellEnd"/>
           </w:p>
         </w:tc>
         <w:tc>
@@ -10320,8 +9599,6 @@
                 <w:lang w:eastAsia="fr-FR"/>
               </w:rPr>
             </w:pPr>
-            <w:proofErr w:type="spellStart"/>
-            <w:proofErr w:type="gramStart"/>
             <w:r>
               <w:rPr>
                 <w:rFonts w:ascii="Times New Roman" w:eastAsia="Times New Roman" w:hAnsi="Times New Roman" w:cs="Times New Roman"/>
@@ -10329,19 +9606,8 @@
                 <w:szCs w:val="24"/>
                 <w:lang w:eastAsia="fr-FR"/>
               </w:rPr>
-              <w:t>created</w:t>
+              <w:t>created_at</w:t>
             </w:r>
-            <w:proofErr w:type="gramEnd"/>
-            <w:r>
-              <w:rPr>
-                <w:rFonts w:ascii="Times New Roman" w:eastAsia="Times New Roman" w:hAnsi="Times New Roman" w:cs="Times New Roman"/>
-                <w:sz w:val="24"/>
-                <w:szCs w:val="24"/>
-                <w:lang w:eastAsia="fr-FR"/>
-              </w:rPr>
-              <w:t>_at</w:t>
-            </w:r>
-            <w:proofErr w:type="spellEnd"/>
           </w:p>
         </w:tc>
         <w:tc>
@@ -10420,22 +9686,8 @@
           <w:lang w:eastAsia="fr-FR"/>
         </w:rPr>
         <w:lastRenderedPageBreak/>
-        <w:t xml:space="preserve">TABLE </w:t>
-      </w:r>
-      <w:proofErr w:type="spellStart"/>
-      <w:r>
-        <w:rPr>
-          <w:rFonts w:ascii="Times New Roman" w:eastAsia="Times New Roman" w:hAnsi="Times New Roman" w:cs="Times New Roman"/>
-          <w:b/>
-          <w:bCs/>
-          <w:kern w:val="36"/>
-          <w:sz w:val="48"/>
-          <w:szCs w:val="48"/>
-          <w:lang w:eastAsia="fr-FR"/>
-        </w:rPr>
-        <w:t>expenses</w:t>
-      </w:r>
-      <w:proofErr w:type="spellEnd"/>
+        <w:t>TABLE expenses</w:t>
+      </w:r>
     </w:p>
     <w:p>
       <w:pPr>
@@ -10563,7 +9815,6 @@
                 <w:lang w:eastAsia="fr-FR"/>
               </w:rPr>
             </w:pPr>
-            <w:proofErr w:type="gramStart"/>
             <w:r>
               <w:rPr>
                 <w:rFonts w:ascii="Times New Roman" w:eastAsia="Times New Roman" w:hAnsi="Times New Roman" w:cs="Times New Roman"/>
@@ -10573,7 +9824,6 @@
               </w:rPr>
               <w:t>id</w:t>
             </w:r>
-            <w:proofErr w:type="gramEnd"/>
           </w:p>
         </w:tc>
         <w:tc>
@@ -10624,8 +9874,6 @@
                 <w:lang w:eastAsia="fr-FR"/>
               </w:rPr>
             </w:pPr>
-            <w:proofErr w:type="spellStart"/>
-            <w:proofErr w:type="gramStart"/>
             <w:r>
               <w:rPr>
                 <w:rFonts w:ascii="Times New Roman" w:eastAsia="Times New Roman" w:hAnsi="Times New Roman" w:cs="Times New Roman"/>
@@ -10635,8 +9883,6 @@
               </w:rPr>
               <w:t>amount</w:t>
             </w:r>
-            <w:proofErr w:type="spellEnd"/>
-            <w:proofErr w:type="gramEnd"/>
           </w:p>
         </w:tc>
         <w:tc>
@@ -10655,7 +9901,6 @@
                 <w:lang w:eastAsia="fr-FR"/>
               </w:rPr>
             </w:pPr>
-            <w:proofErr w:type="gramStart"/>
             <w:r>
               <w:rPr>
                 <w:rFonts w:ascii="Times New Roman" w:eastAsia="Times New Roman" w:hAnsi="Times New Roman" w:cs="Times New Roman"/>
@@ -10663,17 +9908,7 @@
                 <w:szCs w:val="24"/>
                 <w:lang w:eastAsia="fr-FR"/>
               </w:rPr>
-              <w:t>DECIMAL(</w:t>
-            </w:r>
-            <w:proofErr w:type="gramEnd"/>
-            <w:r>
-              <w:rPr>
-                <w:rFonts w:ascii="Times New Roman" w:eastAsia="Times New Roman" w:hAnsi="Times New Roman" w:cs="Times New Roman"/>
-                <w:sz w:val="24"/>
-                <w:szCs w:val="24"/>
-                <w:lang w:eastAsia="fr-FR"/>
-              </w:rPr>
-              <w:t>12,2)</w:t>
+              <w:t>DECIMAL(12,2)</w:t>
             </w:r>
           </w:p>
         </w:tc>
@@ -10698,7 +9933,6 @@
                 <w:lang w:eastAsia="fr-FR"/>
               </w:rPr>
             </w:pPr>
-            <w:proofErr w:type="gramStart"/>
             <w:r>
               <w:rPr>
                 <w:rFonts w:ascii="Times New Roman" w:eastAsia="Times New Roman" w:hAnsi="Times New Roman" w:cs="Times New Roman"/>
@@ -10708,7 +9942,6 @@
               </w:rPr>
               <w:t>description</w:t>
             </w:r>
-            <w:proofErr w:type="gramEnd"/>
           </w:p>
         </w:tc>
         <w:tc>
@@ -10759,8 +9992,6 @@
                 <w:lang w:eastAsia="fr-FR"/>
               </w:rPr>
             </w:pPr>
-            <w:proofErr w:type="spellStart"/>
-            <w:proofErr w:type="gramStart"/>
             <w:r>
               <w:rPr>
                 <w:rFonts w:ascii="Times New Roman" w:eastAsia="Times New Roman" w:hAnsi="Times New Roman" w:cs="Times New Roman"/>
@@ -10768,19 +9999,8 @@
                 <w:szCs w:val="24"/>
                 <w:lang w:eastAsia="fr-FR"/>
               </w:rPr>
-              <w:t>payment</w:t>
+              <w:t>payment_method</w:t>
             </w:r>
-            <w:proofErr w:type="gramEnd"/>
-            <w:r>
-              <w:rPr>
-                <w:rFonts w:ascii="Times New Roman" w:eastAsia="Times New Roman" w:hAnsi="Times New Roman" w:cs="Times New Roman"/>
-                <w:sz w:val="24"/>
-                <w:szCs w:val="24"/>
-                <w:lang w:eastAsia="fr-FR"/>
-              </w:rPr>
-              <w:t>_method</w:t>
-            </w:r>
-            <w:proofErr w:type="spellEnd"/>
           </w:p>
         </w:tc>
         <w:tc>
@@ -10799,7 +10019,6 @@
                 <w:lang w:eastAsia="fr-FR"/>
               </w:rPr>
             </w:pPr>
-            <w:proofErr w:type="gramStart"/>
             <w:r>
               <w:rPr>
                 <w:rFonts w:ascii="Times New Roman" w:eastAsia="Times New Roman" w:hAnsi="Times New Roman" w:cs="Times New Roman"/>
@@ -10807,17 +10026,7 @@
                 <w:szCs w:val="24"/>
                 <w:lang w:eastAsia="fr-FR"/>
               </w:rPr>
-              <w:t>VARCHAR(</w:t>
-            </w:r>
-            <w:proofErr w:type="gramEnd"/>
-            <w:r>
-              <w:rPr>
-                <w:rFonts w:ascii="Times New Roman" w:eastAsia="Times New Roman" w:hAnsi="Times New Roman" w:cs="Times New Roman"/>
-                <w:sz w:val="24"/>
-                <w:szCs w:val="24"/>
-                <w:lang w:eastAsia="fr-FR"/>
-              </w:rPr>
-              <w:t>50)</w:t>
+              <w:t>VARCHAR(50)</w:t>
             </w:r>
           </w:p>
         </w:tc>
@@ -10842,8 +10051,6 @@
                 <w:lang w:eastAsia="fr-FR"/>
               </w:rPr>
             </w:pPr>
-            <w:proofErr w:type="spellStart"/>
-            <w:proofErr w:type="gramStart"/>
             <w:r>
               <w:rPr>
                 <w:rFonts w:ascii="Times New Roman" w:eastAsia="Times New Roman" w:hAnsi="Times New Roman" w:cs="Times New Roman"/>
@@ -10851,19 +10058,8 @@
                 <w:szCs w:val="24"/>
                 <w:lang w:eastAsia="fr-FR"/>
               </w:rPr>
-              <w:t>expense</w:t>
+              <w:t>expense_date</w:t>
             </w:r>
-            <w:proofErr w:type="gramEnd"/>
-            <w:r>
-              <w:rPr>
-                <w:rFonts w:ascii="Times New Roman" w:eastAsia="Times New Roman" w:hAnsi="Times New Roman" w:cs="Times New Roman"/>
-                <w:sz w:val="24"/>
-                <w:szCs w:val="24"/>
-                <w:lang w:eastAsia="fr-FR"/>
-              </w:rPr>
-              <w:t>_date</w:t>
-            </w:r>
-            <w:proofErr w:type="spellEnd"/>
           </w:p>
         </w:tc>
         <w:tc>
@@ -10914,8 +10110,6 @@
                 <w:lang w:eastAsia="fr-FR"/>
               </w:rPr>
             </w:pPr>
-            <w:proofErr w:type="spellStart"/>
-            <w:proofErr w:type="gramStart"/>
             <w:r>
               <w:rPr>
                 <w:rFonts w:ascii="Times New Roman" w:eastAsia="Times New Roman" w:hAnsi="Times New Roman" w:cs="Times New Roman"/>
@@ -10923,19 +10117,8 @@
                 <w:szCs w:val="24"/>
                 <w:lang w:eastAsia="fr-FR"/>
               </w:rPr>
-              <w:t>user</w:t>
+              <w:t>user_id</w:t>
             </w:r>
-            <w:proofErr w:type="gramEnd"/>
-            <w:r>
-              <w:rPr>
-                <w:rFonts w:ascii="Times New Roman" w:eastAsia="Times New Roman" w:hAnsi="Times New Roman" w:cs="Times New Roman"/>
-                <w:sz w:val="24"/>
-                <w:szCs w:val="24"/>
-                <w:lang w:eastAsia="fr-FR"/>
-              </w:rPr>
-              <w:t>_id</w:t>
-            </w:r>
-            <w:proofErr w:type="spellEnd"/>
           </w:p>
         </w:tc>
         <w:tc>
@@ -10986,8 +10169,6 @@
                 <w:lang w:eastAsia="fr-FR"/>
               </w:rPr>
             </w:pPr>
-            <w:proofErr w:type="spellStart"/>
-            <w:proofErr w:type="gramStart"/>
             <w:r>
               <w:rPr>
                 <w:rFonts w:ascii="Times New Roman" w:eastAsia="Times New Roman" w:hAnsi="Times New Roman" w:cs="Times New Roman"/>
@@ -10995,19 +10176,8 @@
                 <w:szCs w:val="24"/>
                 <w:lang w:eastAsia="fr-FR"/>
               </w:rPr>
-              <w:t>category</w:t>
+              <w:t>category_id</w:t>
             </w:r>
-            <w:proofErr w:type="gramEnd"/>
-            <w:r>
-              <w:rPr>
-                <w:rFonts w:ascii="Times New Roman" w:eastAsia="Times New Roman" w:hAnsi="Times New Roman" w:cs="Times New Roman"/>
-                <w:sz w:val="24"/>
-                <w:szCs w:val="24"/>
-                <w:lang w:eastAsia="fr-FR"/>
-              </w:rPr>
-              <w:t>_id</w:t>
-            </w:r>
-            <w:proofErr w:type="spellEnd"/>
           </w:p>
         </w:tc>
         <w:tc>
@@ -11058,8 +10228,6 @@
                 <w:lang w:eastAsia="fr-FR"/>
               </w:rPr>
             </w:pPr>
-            <w:proofErr w:type="spellStart"/>
-            <w:proofErr w:type="gramStart"/>
             <w:r>
               <w:rPr>
                 <w:rFonts w:ascii="Times New Roman" w:eastAsia="Times New Roman" w:hAnsi="Times New Roman" w:cs="Times New Roman"/>
@@ -11067,19 +10235,8 @@
                 <w:szCs w:val="24"/>
                 <w:lang w:eastAsia="fr-FR"/>
               </w:rPr>
-              <w:t>account</w:t>
+              <w:t>account_id</w:t>
             </w:r>
-            <w:proofErr w:type="gramEnd"/>
-            <w:r>
-              <w:rPr>
-                <w:rFonts w:ascii="Times New Roman" w:eastAsia="Times New Roman" w:hAnsi="Times New Roman" w:cs="Times New Roman"/>
-                <w:sz w:val="24"/>
-                <w:szCs w:val="24"/>
-                <w:lang w:eastAsia="fr-FR"/>
-              </w:rPr>
-              <w:t>_id</w:t>
-            </w:r>
-            <w:proofErr w:type="spellEnd"/>
           </w:p>
         </w:tc>
         <w:tc>
@@ -11130,8 +10287,6 @@
                 <w:lang w:eastAsia="fr-FR"/>
               </w:rPr>
             </w:pPr>
-            <w:proofErr w:type="spellStart"/>
-            <w:proofErr w:type="gramStart"/>
             <w:r>
               <w:rPr>
                 <w:rFonts w:ascii="Times New Roman" w:eastAsia="Times New Roman" w:hAnsi="Times New Roman" w:cs="Times New Roman"/>
@@ -11139,19 +10294,8 @@
                 <w:szCs w:val="24"/>
                 <w:lang w:eastAsia="fr-FR"/>
               </w:rPr>
-              <w:t>created</w:t>
+              <w:t>created_at</w:t>
             </w:r>
-            <w:proofErr w:type="gramEnd"/>
-            <w:r>
-              <w:rPr>
-                <w:rFonts w:ascii="Times New Roman" w:eastAsia="Times New Roman" w:hAnsi="Times New Roman" w:cs="Times New Roman"/>
-                <w:sz w:val="24"/>
-                <w:szCs w:val="24"/>
-                <w:lang w:eastAsia="fr-FR"/>
-              </w:rPr>
-              <w:t>_at</w:t>
-            </w:r>
-            <w:proofErr w:type="spellEnd"/>
           </w:p>
         </w:tc>
         <w:tc>
@@ -11229,22 +10373,8 @@
           <w:szCs w:val="48"/>
           <w:lang w:eastAsia="fr-FR"/>
         </w:rPr>
-        <w:t xml:space="preserve">TABLE </w:t>
-      </w:r>
-      <w:proofErr w:type="spellStart"/>
-      <w:r>
-        <w:rPr>
-          <w:rFonts w:ascii="Times New Roman" w:eastAsia="Times New Roman" w:hAnsi="Times New Roman" w:cs="Times New Roman"/>
-          <w:b/>
-          <w:bCs/>
-          <w:kern w:val="36"/>
-          <w:sz w:val="48"/>
-          <w:szCs w:val="48"/>
-          <w:lang w:eastAsia="fr-FR"/>
-        </w:rPr>
-        <w:t>incomes</w:t>
-      </w:r>
-      <w:proofErr w:type="spellEnd"/>
+        <w:t>TABLE incomes</w:t>
+      </w:r>
     </w:p>
     <w:p>
       <w:pPr>
@@ -11372,7 +10502,6 @@
                 <w:lang w:eastAsia="fr-FR"/>
               </w:rPr>
             </w:pPr>
-            <w:proofErr w:type="gramStart"/>
             <w:r>
               <w:rPr>
                 <w:rFonts w:ascii="Times New Roman" w:eastAsia="Times New Roman" w:hAnsi="Times New Roman" w:cs="Times New Roman"/>
@@ -11382,7 +10511,6 @@
               </w:rPr>
               <w:t>id</w:t>
             </w:r>
-            <w:proofErr w:type="gramEnd"/>
           </w:p>
         </w:tc>
         <w:tc>
@@ -11433,8 +10561,6 @@
                 <w:lang w:eastAsia="fr-FR"/>
               </w:rPr>
             </w:pPr>
-            <w:proofErr w:type="spellStart"/>
-            <w:proofErr w:type="gramStart"/>
             <w:r>
               <w:rPr>
                 <w:rFonts w:ascii="Times New Roman" w:eastAsia="Times New Roman" w:hAnsi="Times New Roman" w:cs="Times New Roman"/>
@@ -11444,8 +10570,6 @@
               </w:rPr>
               <w:t>amount</w:t>
             </w:r>
-            <w:proofErr w:type="spellEnd"/>
-            <w:proofErr w:type="gramEnd"/>
           </w:p>
         </w:tc>
         <w:tc>
@@ -11464,7 +10588,6 @@
                 <w:lang w:eastAsia="fr-FR"/>
               </w:rPr>
             </w:pPr>
-            <w:proofErr w:type="gramStart"/>
             <w:r>
               <w:rPr>
                 <w:rFonts w:ascii="Times New Roman" w:eastAsia="Times New Roman" w:hAnsi="Times New Roman" w:cs="Times New Roman"/>
@@ -11472,17 +10595,7 @@
                 <w:szCs w:val="24"/>
                 <w:lang w:eastAsia="fr-FR"/>
               </w:rPr>
-              <w:t>DECIMAL(</w:t>
-            </w:r>
-            <w:proofErr w:type="gramEnd"/>
-            <w:r>
-              <w:rPr>
-                <w:rFonts w:ascii="Times New Roman" w:eastAsia="Times New Roman" w:hAnsi="Times New Roman" w:cs="Times New Roman"/>
-                <w:sz w:val="24"/>
-                <w:szCs w:val="24"/>
-                <w:lang w:eastAsia="fr-FR"/>
-              </w:rPr>
-              <w:t>12,2)</w:t>
+              <w:t>DECIMAL(12,2)</w:t>
             </w:r>
           </w:p>
         </w:tc>
@@ -11507,7 +10620,6 @@
                 <w:lang w:eastAsia="fr-FR"/>
               </w:rPr>
             </w:pPr>
-            <w:proofErr w:type="gramStart"/>
             <w:r>
               <w:rPr>
                 <w:rFonts w:ascii="Times New Roman" w:eastAsia="Times New Roman" w:hAnsi="Times New Roman" w:cs="Times New Roman"/>
@@ -11517,7 +10629,6 @@
               </w:rPr>
               <w:t>source</w:t>
             </w:r>
-            <w:proofErr w:type="gramEnd"/>
           </w:p>
         </w:tc>
         <w:tc>
@@ -11536,7 +10647,6 @@
                 <w:lang w:eastAsia="fr-FR"/>
               </w:rPr>
             </w:pPr>
-            <w:proofErr w:type="gramStart"/>
             <w:r>
               <w:rPr>
                 <w:rFonts w:ascii="Times New Roman" w:eastAsia="Times New Roman" w:hAnsi="Times New Roman" w:cs="Times New Roman"/>
@@ -11544,17 +10654,7 @@
                 <w:szCs w:val="24"/>
                 <w:lang w:eastAsia="fr-FR"/>
               </w:rPr>
-              <w:t>VARCHAR(</w:t>
-            </w:r>
-            <w:proofErr w:type="gramEnd"/>
-            <w:r>
-              <w:rPr>
-                <w:rFonts w:ascii="Times New Roman" w:eastAsia="Times New Roman" w:hAnsi="Times New Roman" w:cs="Times New Roman"/>
-                <w:sz w:val="24"/>
-                <w:szCs w:val="24"/>
-                <w:lang w:eastAsia="fr-FR"/>
-              </w:rPr>
-              <w:t>100)</w:t>
+              <w:t>VARCHAR(100)</w:t>
             </w:r>
           </w:p>
         </w:tc>
@@ -11579,7 +10679,6 @@
                 <w:lang w:eastAsia="fr-FR"/>
               </w:rPr>
             </w:pPr>
-            <w:proofErr w:type="gramStart"/>
             <w:r>
               <w:rPr>
                 <w:rFonts w:ascii="Times New Roman" w:eastAsia="Times New Roman" w:hAnsi="Times New Roman" w:cs="Times New Roman"/>
@@ -11589,7 +10688,6 @@
               </w:rPr>
               <w:t>description</w:t>
             </w:r>
-            <w:proofErr w:type="gramEnd"/>
           </w:p>
         </w:tc>
         <w:tc>
@@ -11640,8 +10738,6 @@
                 <w:lang w:eastAsia="fr-FR"/>
               </w:rPr>
             </w:pPr>
-            <w:proofErr w:type="spellStart"/>
-            <w:proofErr w:type="gramStart"/>
             <w:r>
               <w:rPr>
                 <w:rFonts w:ascii="Times New Roman" w:eastAsia="Times New Roman" w:hAnsi="Times New Roman" w:cs="Times New Roman"/>
@@ -11649,19 +10745,8 @@
                 <w:szCs w:val="24"/>
                 <w:lang w:eastAsia="fr-FR"/>
               </w:rPr>
-              <w:t>income</w:t>
+              <w:t>income_date</w:t>
             </w:r>
-            <w:proofErr w:type="gramEnd"/>
-            <w:r>
-              <w:rPr>
-                <w:rFonts w:ascii="Times New Roman" w:eastAsia="Times New Roman" w:hAnsi="Times New Roman" w:cs="Times New Roman"/>
-                <w:sz w:val="24"/>
-                <w:szCs w:val="24"/>
-                <w:lang w:eastAsia="fr-FR"/>
-              </w:rPr>
-              <w:t>_date</w:t>
-            </w:r>
-            <w:proofErr w:type="spellEnd"/>
           </w:p>
         </w:tc>
         <w:tc>
@@ -11712,8 +10797,6 @@
                 <w:lang w:eastAsia="fr-FR"/>
               </w:rPr>
             </w:pPr>
-            <w:proofErr w:type="spellStart"/>
-            <w:proofErr w:type="gramStart"/>
             <w:r>
               <w:rPr>
                 <w:rFonts w:ascii="Times New Roman" w:eastAsia="Times New Roman" w:hAnsi="Times New Roman" w:cs="Times New Roman"/>
@@ -11721,19 +10804,8 @@
                 <w:szCs w:val="24"/>
                 <w:lang w:eastAsia="fr-FR"/>
               </w:rPr>
-              <w:t>user</w:t>
+              <w:t>user_id</w:t>
             </w:r>
-            <w:proofErr w:type="gramEnd"/>
-            <w:r>
-              <w:rPr>
-                <w:rFonts w:ascii="Times New Roman" w:eastAsia="Times New Roman" w:hAnsi="Times New Roman" w:cs="Times New Roman"/>
-                <w:sz w:val="24"/>
-                <w:szCs w:val="24"/>
-                <w:lang w:eastAsia="fr-FR"/>
-              </w:rPr>
-              <w:t>_id</w:t>
-            </w:r>
-            <w:proofErr w:type="spellEnd"/>
           </w:p>
         </w:tc>
         <w:tc>
@@ -11784,8 +10856,6 @@
                 <w:lang w:eastAsia="fr-FR"/>
               </w:rPr>
             </w:pPr>
-            <w:proofErr w:type="spellStart"/>
-            <w:proofErr w:type="gramStart"/>
             <w:r>
               <w:rPr>
                 <w:rFonts w:ascii="Times New Roman" w:eastAsia="Times New Roman" w:hAnsi="Times New Roman" w:cs="Times New Roman"/>
@@ -11793,19 +10863,8 @@
                 <w:szCs w:val="24"/>
                 <w:lang w:eastAsia="fr-FR"/>
               </w:rPr>
-              <w:t>account</w:t>
+              <w:t>account_id</w:t>
             </w:r>
-            <w:proofErr w:type="gramEnd"/>
-            <w:r>
-              <w:rPr>
-                <w:rFonts w:ascii="Times New Roman" w:eastAsia="Times New Roman" w:hAnsi="Times New Roman" w:cs="Times New Roman"/>
-                <w:sz w:val="24"/>
-                <w:szCs w:val="24"/>
-                <w:lang w:eastAsia="fr-FR"/>
-              </w:rPr>
-              <w:t>_id</w:t>
-            </w:r>
-            <w:proofErr w:type="spellEnd"/>
           </w:p>
         </w:tc>
         <w:tc>
@@ -11856,8 +10915,6 @@
                 <w:lang w:eastAsia="fr-FR"/>
               </w:rPr>
             </w:pPr>
-            <w:proofErr w:type="spellStart"/>
-            <w:proofErr w:type="gramStart"/>
             <w:r>
               <w:rPr>
                 <w:rFonts w:ascii="Times New Roman" w:eastAsia="Times New Roman" w:hAnsi="Times New Roman" w:cs="Times New Roman"/>
@@ -11865,19 +10922,8 @@
                 <w:szCs w:val="24"/>
                 <w:lang w:eastAsia="fr-FR"/>
               </w:rPr>
-              <w:t>created</w:t>
+              <w:t>created_at</w:t>
             </w:r>
-            <w:proofErr w:type="gramEnd"/>
-            <w:r>
-              <w:rPr>
-                <w:rFonts w:ascii="Times New Roman" w:eastAsia="Times New Roman" w:hAnsi="Times New Roman" w:cs="Times New Roman"/>
-                <w:sz w:val="24"/>
-                <w:szCs w:val="24"/>
-                <w:lang w:eastAsia="fr-FR"/>
-              </w:rPr>
-              <w:t>_at</w:t>
-            </w:r>
-            <w:proofErr w:type="spellEnd"/>
           </w:p>
         </w:tc>
         <w:tc>
@@ -12084,7 +11130,6 @@
                 <w:lang w:eastAsia="fr-FR"/>
               </w:rPr>
             </w:pPr>
-            <w:proofErr w:type="gramStart"/>
             <w:r>
               <w:rPr>
                 <w:rFonts w:ascii="Times New Roman" w:eastAsia="Times New Roman" w:hAnsi="Times New Roman" w:cs="Times New Roman"/>
@@ -12094,7 +11139,6 @@
               </w:rPr>
               <w:t>id</w:t>
             </w:r>
-            <w:proofErr w:type="gramEnd"/>
           </w:p>
         </w:tc>
         <w:tc>
@@ -12145,8 +11189,6 @@
                 <w:lang w:eastAsia="fr-FR"/>
               </w:rPr>
             </w:pPr>
-            <w:proofErr w:type="spellStart"/>
-            <w:proofErr w:type="gramStart"/>
             <w:r>
               <w:rPr>
                 <w:rFonts w:ascii="Times New Roman" w:eastAsia="Times New Roman" w:hAnsi="Times New Roman" w:cs="Times New Roman"/>
@@ -12154,19 +11196,8 @@
                 <w:szCs w:val="24"/>
                 <w:lang w:eastAsia="fr-FR"/>
               </w:rPr>
-              <w:t>amount</w:t>
+              <w:t>amount_limit</w:t>
             </w:r>
-            <w:proofErr w:type="gramEnd"/>
-            <w:r>
-              <w:rPr>
-                <w:rFonts w:ascii="Times New Roman" w:eastAsia="Times New Roman" w:hAnsi="Times New Roman" w:cs="Times New Roman"/>
-                <w:sz w:val="24"/>
-                <w:szCs w:val="24"/>
-                <w:lang w:eastAsia="fr-FR"/>
-              </w:rPr>
-              <w:t>_limit</w:t>
-            </w:r>
-            <w:proofErr w:type="spellEnd"/>
           </w:p>
         </w:tc>
         <w:tc>
@@ -12185,7 +11216,6 @@
                 <w:lang w:eastAsia="fr-FR"/>
               </w:rPr>
             </w:pPr>
-            <w:proofErr w:type="gramStart"/>
             <w:r>
               <w:rPr>
                 <w:rFonts w:ascii="Times New Roman" w:eastAsia="Times New Roman" w:hAnsi="Times New Roman" w:cs="Times New Roman"/>
@@ -12193,17 +11223,7 @@
                 <w:szCs w:val="24"/>
                 <w:lang w:eastAsia="fr-FR"/>
               </w:rPr>
-              <w:t>DECIMAL(</w:t>
-            </w:r>
-            <w:proofErr w:type="gramEnd"/>
-            <w:r>
-              <w:rPr>
-                <w:rFonts w:ascii="Times New Roman" w:eastAsia="Times New Roman" w:hAnsi="Times New Roman" w:cs="Times New Roman"/>
-                <w:sz w:val="24"/>
-                <w:szCs w:val="24"/>
-                <w:lang w:eastAsia="fr-FR"/>
-              </w:rPr>
-              <w:t>12,2)</w:t>
+              <w:t>DECIMAL(12,2)</w:t>
             </w:r>
           </w:p>
         </w:tc>
@@ -12228,8 +11248,6 @@
                 <w:lang w:eastAsia="fr-FR"/>
               </w:rPr>
             </w:pPr>
-            <w:proofErr w:type="spellStart"/>
-            <w:proofErr w:type="gramStart"/>
             <w:r>
               <w:rPr>
                 <w:rFonts w:ascii="Times New Roman" w:eastAsia="Times New Roman" w:hAnsi="Times New Roman" w:cs="Times New Roman"/>
@@ -12239,8 +11257,6 @@
               </w:rPr>
               <w:t>month</w:t>
             </w:r>
-            <w:proofErr w:type="spellEnd"/>
-            <w:proofErr w:type="gramEnd"/>
           </w:p>
         </w:tc>
         <w:tc>
@@ -12291,8 +11307,6 @@
                 <w:lang w:eastAsia="fr-FR"/>
               </w:rPr>
             </w:pPr>
-            <w:proofErr w:type="spellStart"/>
-            <w:proofErr w:type="gramStart"/>
             <w:r>
               <w:rPr>
                 <w:rFonts w:ascii="Times New Roman" w:eastAsia="Times New Roman" w:hAnsi="Times New Roman" w:cs="Times New Roman"/>
@@ -12302,8 +11316,6 @@
               </w:rPr>
               <w:t>year</w:t>
             </w:r>
-            <w:proofErr w:type="spellEnd"/>
-            <w:proofErr w:type="gramEnd"/>
           </w:p>
         </w:tc>
         <w:tc>
@@ -12354,8 +11366,6 @@
                 <w:lang w:eastAsia="fr-FR"/>
               </w:rPr>
             </w:pPr>
-            <w:proofErr w:type="spellStart"/>
-            <w:proofErr w:type="gramStart"/>
             <w:r>
               <w:rPr>
                 <w:rFonts w:ascii="Times New Roman" w:eastAsia="Times New Roman" w:hAnsi="Times New Roman" w:cs="Times New Roman"/>
@@ -12363,19 +11373,8 @@
                 <w:szCs w:val="24"/>
                 <w:lang w:eastAsia="fr-FR"/>
               </w:rPr>
-              <w:t>user</w:t>
+              <w:t>user_id</w:t>
             </w:r>
-            <w:proofErr w:type="gramEnd"/>
-            <w:r>
-              <w:rPr>
-                <w:rFonts w:ascii="Times New Roman" w:eastAsia="Times New Roman" w:hAnsi="Times New Roman" w:cs="Times New Roman"/>
-                <w:sz w:val="24"/>
-                <w:szCs w:val="24"/>
-                <w:lang w:eastAsia="fr-FR"/>
-              </w:rPr>
-              <w:t>_id</w:t>
-            </w:r>
-            <w:proofErr w:type="spellEnd"/>
           </w:p>
         </w:tc>
         <w:tc>
@@ -12426,8 +11425,6 @@
                 <w:lang w:eastAsia="fr-FR"/>
               </w:rPr>
             </w:pPr>
-            <w:proofErr w:type="spellStart"/>
-            <w:proofErr w:type="gramStart"/>
             <w:r>
               <w:rPr>
                 <w:rFonts w:ascii="Times New Roman" w:eastAsia="Times New Roman" w:hAnsi="Times New Roman" w:cs="Times New Roman"/>
@@ -12436,19 +11433,8 @@
                 <w:lang w:eastAsia="fr-FR"/>
               </w:rPr>
               <w:lastRenderedPageBreak/>
-              <w:t>category</w:t>
+              <w:t>category_id</w:t>
             </w:r>
-            <w:proofErr w:type="gramEnd"/>
-            <w:r>
-              <w:rPr>
-                <w:rFonts w:ascii="Times New Roman" w:eastAsia="Times New Roman" w:hAnsi="Times New Roman" w:cs="Times New Roman"/>
-                <w:sz w:val="24"/>
-                <w:szCs w:val="24"/>
-                <w:lang w:eastAsia="fr-FR"/>
-              </w:rPr>
-              <w:t>_id</w:t>
-            </w:r>
-            <w:proofErr w:type="spellEnd"/>
           </w:p>
         </w:tc>
         <w:tc>
@@ -12499,8 +11485,6 @@
                 <w:lang w:eastAsia="fr-FR"/>
               </w:rPr>
             </w:pPr>
-            <w:proofErr w:type="spellStart"/>
-            <w:proofErr w:type="gramStart"/>
             <w:r>
               <w:rPr>
                 <w:rFonts w:ascii="Times New Roman" w:eastAsia="Times New Roman" w:hAnsi="Times New Roman" w:cs="Times New Roman"/>
@@ -12508,19 +11492,8 @@
                 <w:szCs w:val="24"/>
                 <w:lang w:eastAsia="fr-FR"/>
               </w:rPr>
-              <w:t>created</w:t>
+              <w:t>created_at</w:t>
             </w:r>
-            <w:proofErr w:type="gramEnd"/>
-            <w:r>
-              <w:rPr>
-                <w:rFonts w:ascii="Times New Roman" w:eastAsia="Times New Roman" w:hAnsi="Times New Roman" w:cs="Times New Roman"/>
-                <w:sz w:val="24"/>
-                <w:szCs w:val="24"/>
-                <w:lang w:eastAsia="fr-FR"/>
-              </w:rPr>
-              <w:t>_at</w:t>
-            </w:r>
-            <w:proofErr w:type="spellEnd"/>
           </w:p>
         </w:tc>
         <w:tc>
@@ -12598,22 +11571,8 @@
           <w:szCs w:val="48"/>
           <w:lang w:eastAsia="fr-FR"/>
         </w:rPr>
-        <w:t xml:space="preserve">TABLE </w:t>
-      </w:r>
-      <w:proofErr w:type="spellStart"/>
-      <w:r>
-        <w:rPr>
-          <w:rFonts w:ascii="Times New Roman" w:eastAsia="Times New Roman" w:hAnsi="Times New Roman" w:cs="Times New Roman"/>
-          <w:b/>
-          <w:bCs/>
-          <w:kern w:val="36"/>
-          <w:sz w:val="48"/>
-          <w:szCs w:val="48"/>
-          <w:lang w:eastAsia="fr-FR"/>
-        </w:rPr>
-        <w:t>savings_goals</w:t>
-      </w:r>
-      <w:proofErr w:type="spellEnd"/>
+        <w:t>TABLE savings_goals</w:t>
+      </w:r>
     </w:p>
     <w:p>
       <w:pPr>
@@ -12741,7 +11700,6 @@
                 <w:lang w:eastAsia="fr-FR"/>
               </w:rPr>
             </w:pPr>
-            <w:proofErr w:type="gramStart"/>
             <w:r>
               <w:rPr>
                 <w:rFonts w:ascii="Times New Roman" w:eastAsia="Times New Roman" w:hAnsi="Times New Roman" w:cs="Times New Roman"/>
@@ -12751,7 +11709,6 @@
               </w:rPr>
               <w:t>id</w:t>
             </w:r>
-            <w:proofErr w:type="gramEnd"/>
           </w:p>
         </w:tc>
         <w:tc>
@@ -12802,8 +11759,6 @@
                 <w:lang w:eastAsia="fr-FR"/>
               </w:rPr>
             </w:pPr>
-            <w:proofErr w:type="spellStart"/>
-            <w:proofErr w:type="gramStart"/>
             <w:r>
               <w:rPr>
                 <w:rFonts w:ascii="Times New Roman" w:eastAsia="Times New Roman" w:hAnsi="Times New Roman" w:cs="Times New Roman"/>
@@ -12813,8 +11768,6 @@
               </w:rPr>
               <w:t>title</w:t>
             </w:r>
-            <w:proofErr w:type="spellEnd"/>
-            <w:proofErr w:type="gramEnd"/>
           </w:p>
         </w:tc>
         <w:tc>
@@ -12833,7 +11786,6 @@
                 <w:lang w:eastAsia="fr-FR"/>
               </w:rPr>
             </w:pPr>
-            <w:proofErr w:type="gramStart"/>
             <w:r>
               <w:rPr>
                 <w:rFonts w:ascii="Times New Roman" w:eastAsia="Times New Roman" w:hAnsi="Times New Roman" w:cs="Times New Roman"/>
@@ -12841,17 +11793,7 @@
                 <w:szCs w:val="24"/>
                 <w:lang w:eastAsia="fr-FR"/>
               </w:rPr>
-              <w:t>VARCHAR(</w:t>
-            </w:r>
-            <w:proofErr w:type="gramEnd"/>
-            <w:r>
-              <w:rPr>
-                <w:rFonts w:ascii="Times New Roman" w:eastAsia="Times New Roman" w:hAnsi="Times New Roman" w:cs="Times New Roman"/>
-                <w:sz w:val="24"/>
-                <w:szCs w:val="24"/>
-                <w:lang w:eastAsia="fr-FR"/>
-              </w:rPr>
-              <w:t>150)</w:t>
+              <w:t>VARCHAR(150)</w:t>
             </w:r>
           </w:p>
         </w:tc>
@@ -12876,8 +11818,6 @@
                 <w:lang w:eastAsia="fr-FR"/>
               </w:rPr>
             </w:pPr>
-            <w:proofErr w:type="spellStart"/>
-            <w:proofErr w:type="gramStart"/>
             <w:r>
               <w:rPr>
                 <w:rFonts w:ascii="Times New Roman" w:eastAsia="Times New Roman" w:hAnsi="Times New Roman" w:cs="Times New Roman"/>
@@ -12885,19 +11825,8 @@
                 <w:szCs w:val="24"/>
                 <w:lang w:eastAsia="fr-FR"/>
               </w:rPr>
-              <w:t>target</w:t>
+              <w:t>target_amount</w:t>
             </w:r>
-            <w:proofErr w:type="gramEnd"/>
-            <w:r>
-              <w:rPr>
-                <w:rFonts w:ascii="Times New Roman" w:eastAsia="Times New Roman" w:hAnsi="Times New Roman" w:cs="Times New Roman"/>
-                <w:sz w:val="24"/>
-                <w:szCs w:val="24"/>
-                <w:lang w:eastAsia="fr-FR"/>
-              </w:rPr>
-              <w:t>_amount</w:t>
-            </w:r>
-            <w:proofErr w:type="spellEnd"/>
           </w:p>
         </w:tc>
         <w:tc>
@@ -12916,7 +11845,6 @@
                 <w:lang w:eastAsia="fr-FR"/>
               </w:rPr>
             </w:pPr>
-            <w:proofErr w:type="gramStart"/>
             <w:r>
               <w:rPr>
                 <w:rFonts w:ascii="Times New Roman" w:eastAsia="Times New Roman" w:hAnsi="Times New Roman" w:cs="Times New Roman"/>
@@ -12924,17 +11852,7 @@
                 <w:szCs w:val="24"/>
                 <w:lang w:eastAsia="fr-FR"/>
               </w:rPr>
-              <w:t>DECIMAL(</w:t>
-            </w:r>
-            <w:proofErr w:type="gramEnd"/>
-            <w:r>
-              <w:rPr>
-                <w:rFonts w:ascii="Times New Roman" w:eastAsia="Times New Roman" w:hAnsi="Times New Roman" w:cs="Times New Roman"/>
-                <w:sz w:val="24"/>
-                <w:szCs w:val="24"/>
-                <w:lang w:eastAsia="fr-FR"/>
-              </w:rPr>
-              <w:t>12,2)</w:t>
+              <w:t>DECIMAL(12,2)</w:t>
             </w:r>
           </w:p>
         </w:tc>
@@ -12959,8 +11877,6 @@
                 <w:lang w:eastAsia="fr-FR"/>
               </w:rPr>
             </w:pPr>
-            <w:proofErr w:type="spellStart"/>
-            <w:proofErr w:type="gramStart"/>
             <w:r>
               <w:rPr>
                 <w:rFonts w:ascii="Times New Roman" w:eastAsia="Times New Roman" w:hAnsi="Times New Roman" w:cs="Times New Roman"/>
@@ -12968,19 +11884,8 @@
                 <w:szCs w:val="24"/>
                 <w:lang w:eastAsia="fr-FR"/>
               </w:rPr>
-              <w:t>current</w:t>
+              <w:t>current_amount</w:t>
             </w:r>
-            <w:proofErr w:type="gramEnd"/>
-            <w:r>
-              <w:rPr>
-                <w:rFonts w:ascii="Times New Roman" w:eastAsia="Times New Roman" w:hAnsi="Times New Roman" w:cs="Times New Roman"/>
-                <w:sz w:val="24"/>
-                <w:szCs w:val="24"/>
-                <w:lang w:eastAsia="fr-FR"/>
-              </w:rPr>
-              <w:t>_amount</w:t>
-            </w:r>
-            <w:proofErr w:type="spellEnd"/>
           </w:p>
         </w:tc>
         <w:tc>
@@ -12999,7 +11904,6 @@
                 <w:lang w:eastAsia="fr-FR"/>
               </w:rPr>
             </w:pPr>
-            <w:proofErr w:type="gramStart"/>
             <w:r>
               <w:rPr>
                 <w:rFonts w:ascii="Times New Roman" w:eastAsia="Times New Roman" w:hAnsi="Times New Roman" w:cs="Times New Roman"/>
@@ -13007,17 +11911,7 @@
                 <w:szCs w:val="24"/>
                 <w:lang w:eastAsia="fr-FR"/>
               </w:rPr>
-              <w:t>DECIMAL(</w:t>
-            </w:r>
-            <w:proofErr w:type="gramEnd"/>
-            <w:r>
-              <w:rPr>
-                <w:rFonts w:ascii="Times New Roman" w:eastAsia="Times New Roman" w:hAnsi="Times New Roman" w:cs="Times New Roman"/>
-                <w:sz w:val="24"/>
-                <w:szCs w:val="24"/>
-                <w:lang w:eastAsia="fr-FR"/>
-              </w:rPr>
-              <w:t>12,2)</w:t>
+              <w:t>DECIMAL(12,2)</w:t>
             </w:r>
           </w:p>
         </w:tc>
@@ -13042,7 +11936,6 @@
                 <w:lang w:eastAsia="fr-FR"/>
               </w:rPr>
             </w:pPr>
-            <w:proofErr w:type="gramStart"/>
             <w:r>
               <w:rPr>
                 <w:rFonts w:ascii="Times New Roman" w:eastAsia="Times New Roman" w:hAnsi="Times New Roman" w:cs="Times New Roman"/>
@@ -13052,7 +11945,6 @@
               </w:rPr>
               <w:t>deadline</w:t>
             </w:r>
-            <w:proofErr w:type="gramEnd"/>
           </w:p>
         </w:tc>
         <w:tc>
@@ -13103,8 +11995,6 @@
                 <w:lang w:eastAsia="fr-FR"/>
               </w:rPr>
             </w:pPr>
-            <w:proofErr w:type="spellStart"/>
-            <w:proofErr w:type="gramStart"/>
             <w:r>
               <w:rPr>
                 <w:rFonts w:ascii="Times New Roman" w:eastAsia="Times New Roman" w:hAnsi="Times New Roman" w:cs="Times New Roman"/>
@@ -13112,19 +12002,8 @@
                 <w:szCs w:val="24"/>
                 <w:lang w:eastAsia="fr-FR"/>
               </w:rPr>
-              <w:t>user</w:t>
+              <w:t>user_id</w:t>
             </w:r>
-            <w:proofErr w:type="gramEnd"/>
-            <w:r>
-              <w:rPr>
-                <w:rFonts w:ascii="Times New Roman" w:eastAsia="Times New Roman" w:hAnsi="Times New Roman" w:cs="Times New Roman"/>
-                <w:sz w:val="24"/>
-                <w:szCs w:val="24"/>
-                <w:lang w:eastAsia="fr-FR"/>
-              </w:rPr>
-              <w:t>_id</w:t>
-            </w:r>
-            <w:proofErr w:type="spellEnd"/>
           </w:p>
         </w:tc>
         <w:tc>
@@ -13175,8 +12054,6 @@
                 <w:lang w:eastAsia="fr-FR"/>
               </w:rPr>
             </w:pPr>
-            <w:proofErr w:type="spellStart"/>
-            <w:proofErr w:type="gramStart"/>
             <w:r>
               <w:rPr>
                 <w:rFonts w:ascii="Times New Roman" w:eastAsia="Times New Roman" w:hAnsi="Times New Roman" w:cs="Times New Roman"/>
@@ -13184,19 +12061,8 @@
                 <w:szCs w:val="24"/>
                 <w:lang w:eastAsia="fr-FR"/>
               </w:rPr>
-              <w:t>created</w:t>
+              <w:t>created_at</w:t>
             </w:r>
-            <w:proofErr w:type="gramEnd"/>
-            <w:r>
-              <w:rPr>
-                <w:rFonts w:ascii="Times New Roman" w:eastAsia="Times New Roman" w:hAnsi="Times New Roman" w:cs="Times New Roman"/>
-                <w:sz w:val="24"/>
-                <w:szCs w:val="24"/>
-                <w:lang w:eastAsia="fr-FR"/>
-              </w:rPr>
-              <w:t>_at</w:t>
-            </w:r>
-            <w:proofErr w:type="spellEnd"/>
           </w:p>
         </w:tc>
         <w:tc>
@@ -13329,8 +12195,6 @@
           <w:lang w:eastAsia="fr-FR"/>
         </w:rPr>
       </w:pPr>
-      <w:proofErr w:type="spellStart"/>
-      <w:proofErr w:type="gramStart"/>
       <w:r>
         <w:rPr>
           <w:rFonts w:ascii="Times New Roman" w:eastAsia="Times New Roman" w:hAnsi="Times New Roman" w:cs="Times New Roman"/>
@@ -13340,34 +12204,8 @@
           <w:szCs w:val="36"/>
           <w:lang w:eastAsia="fr-FR"/>
         </w:rPr>
-        <w:t>users</w:t>
-      </w:r>
-      <w:proofErr w:type="spellEnd"/>
-      <w:proofErr w:type="gramEnd"/>
-      <w:r>
-        <w:rPr>
-          <w:rFonts w:ascii="Times New Roman" w:eastAsia="Times New Roman" w:hAnsi="Times New Roman" w:cs="Times New Roman"/>
-          <w:b/>
-          <w:bCs/>
-          <w:sz w:val="36"/>
-          <w:szCs w:val="36"/>
-          <w:lang w:eastAsia="fr-FR"/>
-        </w:rPr>
-        <w:t xml:space="preserve"> → </w:t>
-      </w:r>
-      <w:proofErr w:type="spellStart"/>
-      <w:r>
-        <w:rPr>
-          <w:rFonts w:ascii="Times New Roman" w:eastAsia="Times New Roman" w:hAnsi="Times New Roman" w:cs="Times New Roman"/>
-          <w:b/>
-          <w:bCs/>
-          <w:sz w:val="36"/>
-          <w:szCs w:val="36"/>
-          <w:lang w:eastAsia="fr-FR"/>
-        </w:rPr>
-        <w:t>expenses</w:t>
-      </w:r>
-      <w:proofErr w:type="spellEnd"/>
+        <w:t>users → expenses</w:t>
+      </w:r>
     </w:p>
     <w:p>
       <w:pPr>
@@ -13424,19 +12262,8 @@
           <w:szCs w:val="20"/>
           <w:lang w:eastAsia="fr-FR"/>
         </w:rPr>
-        <w:t xml:space="preserve">1 user -&gt; plusieurs </w:t>
-      </w:r>
-      <w:proofErr w:type="spellStart"/>
-      <w:r>
-        <w:rPr>
-          <w:rFonts w:ascii="Courier New" w:eastAsia="Times New Roman" w:hAnsi="Courier New" w:cs="Courier New"/>
-          <w:sz w:val="20"/>
-          <w:szCs w:val="20"/>
-          <w:lang w:eastAsia="fr-FR"/>
-        </w:rPr>
-        <w:t>expenses</w:t>
-      </w:r>
-      <w:proofErr w:type="spellEnd"/>
+        <w:t>1 user -&gt; plusieurs expenses</w:t>
+      </w:r>
     </w:p>
     <w:p>
       <w:pPr>
@@ -13473,8 +12300,6 @@
           <w:lang w:eastAsia="fr-FR"/>
         </w:rPr>
       </w:pPr>
-      <w:proofErr w:type="spellStart"/>
-      <w:proofErr w:type="gramStart"/>
       <w:r>
         <w:rPr>
           <w:rFonts w:ascii="Times New Roman" w:eastAsia="Times New Roman" w:hAnsi="Times New Roman" w:cs="Times New Roman"/>
@@ -13484,34 +12309,8 @@
           <w:szCs w:val="36"/>
           <w:lang w:eastAsia="fr-FR"/>
         </w:rPr>
-        <w:t>users</w:t>
-      </w:r>
-      <w:proofErr w:type="spellEnd"/>
-      <w:proofErr w:type="gramEnd"/>
-      <w:r>
-        <w:rPr>
-          <w:rFonts w:ascii="Times New Roman" w:eastAsia="Times New Roman" w:hAnsi="Times New Roman" w:cs="Times New Roman"/>
-          <w:b/>
-          <w:bCs/>
-          <w:sz w:val="36"/>
-          <w:szCs w:val="36"/>
-          <w:lang w:eastAsia="fr-FR"/>
-        </w:rPr>
-        <w:t xml:space="preserve"> → </w:t>
-      </w:r>
-      <w:proofErr w:type="spellStart"/>
-      <w:r>
-        <w:rPr>
-          <w:rFonts w:ascii="Times New Roman" w:eastAsia="Times New Roman" w:hAnsi="Times New Roman" w:cs="Times New Roman"/>
-          <w:b/>
-          <w:bCs/>
-          <w:sz w:val="36"/>
-          <w:szCs w:val="36"/>
-          <w:lang w:eastAsia="fr-FR"/>
-        </w:rPr>
-        <w:t>incomes</w:t>
-      </w:r>
-      <w:proofErr w:type="spellEnd"/>
+        <w:t>users → incomes</w:t>
+      </w:r>
     </w:p>
     <w:p>
       <w:pPr>
@@ -13548,19 +12347,8 @@
           <w:szCs w:val="20"/>
           <w:lang w:eastAsia="fr-FR"/>
         </w:rPr>
-        <w:t xml:space="preserve">1 user -&gt; plusieurs </w:t>
-      </w:r>
-      <w:proofErr w:type="spellStart"/>
-      <w:r>
-        <w:rPr>
-          <w:rFonts w:ascii="Courier New" w:eastAsia="Times New Roman" w:hAnsi="Courier New" w:cs="Courier New"/>
-          <w:sz w:val="20"/>
-          <w:szCs w:val="20"/>
-          <w:lang w:eastAsia="fr-FR"/>
-        </w:rPr>
-        <w:t>incomes</w:t>
-      </w:r>
-      <w:proofErr w:type="spellEnd"/>
+        <w:t>1 user -&gt; plusieurs incomes</w:t>
+      </w:r>
     </w:p>
     <w:p>
       <w:pPr>
@@ -13597,8 +12385,6 @@
           <w:lang w:eastAsia="fr-FR"/>
         </w:rPr>
       </w:pPr>
-      <w:proofErr w:type="spellStart"/>
-      <w:proofErr w:type="gramStart"/>
       <w:r>
         <w:rPr>
           <w:rFonts w:ascii="Times New Roman" w:eastAsia="Times New Roman" w:hAnsi="Times New Roman" w:cs="Times New Roman"/>
@@ -13608,34 +12394,8 @@
           <w:szCs w:val="36"/>
           <w:lang w:eastAsia="fr-FR"/>
         </w:rPr>
-        <w:t>users</w:t>
-      </w:r>
-      <w:proofErr w:type="spellEnd"/>
-      <w:proofErr w:type="gramEnd"/>
-      <w:r>
-        <w:rPr>
-          <w:rFonts w:ascii="Times New Roman" w:eastAsia="Times New Roman" w:hAnsi="Times New Roman" w:cs="Times New Roman"/>
-          <w:b/>
-          <w:bCs/>
-          <w:sz w:val="36"/>
-          <w:szCs w:val="36"/>
-          <w:lang w:eastAsia="fr-FR"/>
-        </w:rPr>
-        <w:t xml:space="preserve"> → </w:t>
-      </w:r>
-      <w:proofErr w:type="spellStart"/>
-      <w:r>
-        <w:rPr>
-          <w:rFonts w:ascii="Times New Roman" w:eastAsia="Times New Roman" w:hAnsi="Times New Roman" w:cs="Times New Roman"/>
-          <w:b/>
-          <w:bCs/>
-          <w:sz w:val="36"/>
-          <w:szCs w:val="36"/>
-          <w:lang w:eastAsia="fr-FR"/>
-        </w:rPr>
-        <w:t>accounts</w:t>
-      </w:r>
-      <w:proofErr w:type="spellEnd"/>
+        <w:t>users → accounts</w:t>
+      </w:r>
     </w:p>
     <w:p>
       <w:pPr>
@@ -13672,19 +12432,8 @@
           <w:szCs w:val="20"/>
           <w:lang w:eastAsia="fr-FR"/>
         </w:rPr>
-        <w:t xml:space="preserve">1 user -&gt; plusieurs </w:t>
-      </w:r>
-      <w:proofErr w:type="spellStart"/>
-      <w:r>
-        <w:rPr>
-          <w:rFonts w:ascii="Courier New" w:eastAsia="Times New Roman" w:hAnsi="Courier New" w:cs="Courier New"/>
-          <w:sz w:val="20"/>
-          <w:szCs w:val="20"/>
-          <w:lang w:eastAsia="fr-FR"/>
-        </w:rPr>
-        <w:t>accounts</w:t>
-      </w:r>
-      <w:proofErr w:type="spellEnd"/>
+        <w:t>1 user -&gt; plusieurs accounts</w:t>
+      </w:r>
     </w:p>
     <w:p>
       <w:pPr>
@@ -13721,8 +12470,6 @@
           <w:lang w:eastAsia="fr-FR"/>
         </w:rPr>
       </w:pPr>
-      <w:proofErr w:type="spellStart"/>
-      <w:proofErr w:type="gramStart"/>
       <w:r>
         <w:rPr>
           <w:rFonts w:ascii="Times New Roman" w:eastAsia="Times New Roman" w:hAnsi="Times New Roman" w:cs="Times New Roman"/>
@@ -13732,34 +12479,8 @@
           <w:szCs w:val="36"/>
           <w:lang w:eastAsia="fr-FR"/>
         </w:rPr>
-        <w:t>users</w:t>
-      </w:r>
-      <w:proofErr w:type="spellEnd"/>
-      <w:proofErr w:type="gramEnd"/>
-      <w:r>
-        <w:rPr>
-          <w:rFonts w:ascii="Times New Roman" w:eastAsia="Times New Roman" w:hAnsi="Times New Roman" w:cs="Times New Roman"/>
-          <w:b/>
-          <w:bCs/>
-          <w:sz w:val="36"/>
-          <w:szCs w:val="36"/>
-          <w:lang w:eastAsia="fr-FR"/>
-        </w:rPr>
-        <w:t xml:space="preserve"> → </w:t>
-      </w:r>
-      <w:proofErr w:type="spellStart"/>
-      <w:r>
-        <w:rPr>
-          <w:rFonts w:ascii="Times New Roman" w:eastAsia="Times New Roman" w:hAnsi="Times New Roman" w:cs="Times New Roman"/>
-          <w:b/>
-          <w:bCs/>
-          <w:sz w:val="36"/>
-          <w:szCs w:val="36"/>
-          <w:lang w:eastAsia="fr-FR"/>
-        </w:rPr>
-        <w:t>categories</w:t>
-      </w:r>
-      <w:proofErr w:type="spellEnd"/>
+        <w:t>users → categories</w:t>
+      </w:r>
     </w:p>
     <w:p>
       <w:pPr>
@@ -13796,19 +12517,8 @@
           <w:szCs w:val="20"/>
           <w:lang w:eastAsia="fr-FR"/>
         </w:rPr>
-        <w:t xml:space="preserve">1 user -&gt; plusieurs </w:t>
-      </w:r>
-      <w:proofErr w:type="spellStart"/>
-      <w:r>
-        <w:rPr>
-          <w:rFonts w:ascii="Courier New" w:eastAsia="Times New Roman" w:hAnsi="Courier New" w:cs="Courier New"/>
-          <w:sz w:val="20"/>
-          <w:szCs w:val="20"/>
-          <w:lang w:eastAsia="fr-FR"/>
-        </w:rPr>
-        <w:t>categories</w:t>
-      </w:r>
-      <w:proofErr w:type="spellEnd"/>
+        <w:t>1 user -&gt; plusieurs categories</w:t>
+      </w:r>
     </w:p>
     <w:p>
       <w:pPr>
@@ -13846,8 +12556,6 @@
           <w:lang w:eastAsia="fr-FR"/>
         </w:rPr>
       </w:pPr>
-      <w:proofErr w:type="spellStart"/>
-      <w:proofErr w:type="gramStart"/>
       <w:r>
         <w:rPr>
           <w:rFonts w:ascii="Times New Roman" w:eastAsia="Times New Roman" w:hAnsi="Times New Roman" w:cs="Times New Roman"/>
@@ -13857,20 +12565,7 @@
           <w:szCs w:val="36"/>
           <w:lang w:eastAsia="fr-FR"/>
         </w:rPr>
-        <w:t>users</w:t>
-      </w:r>
-      <w:proofErr w:type="spellEnd"/>
-      <w:proofErr w:type="gramEnd"/>
-      <w:r>
-        <w:rPr>
-          <w:rFonts w:ascii="Times New Roman" w:eastAsia="Times New Roman" w:hAnsi="Times New Roman" w:cs="Times New Roman"/>
-          <w:b/>
-          <w:bCs/>
-          <w:sz w:val="36"/>
-          <w:szCs w:val="36"/>
-          <w:lang w:eastAsia="fr-FR"/>
-        </w:rPr>
-        <w:t xml:space="preserve"> → budgets</w:t>
+        <w:t>users → budgets</w:t>
       </w:r>
     </w:p>
     <w:p>
@@ -13946,8 +12641,6 @@
           <w:lang w:eastAsia="fr-FR"/>
         </w:rPr>
       </w:pPr>
-      <w:proofErr w:type="spellStart"/>
-      <w:proofErr w:type="gramStart"/>
       <w:r>
         <w:rPr>
           <w:rFonts w:ascii="Times New Roman" w:eastAsia="Times New Roman" w:hAnsi="Times New Roman" w:cs="Times New Roman"/>
@@ -13957,34 +12650,8 @@
           <w:szCs w:val="36"/>
           <w:lang w:eastAsia="fr-FR"/>
         </w:rPr>
-        <w:t>users</w:t>
-      </w:r>
-      <w:proofErr w:type="spellEnd"/>
-      <w:proofErr w:type="gramEnd"/>
-      <w:r>
-        <w:rPr>
-          <w:rFonts w:ascii="Times New Roman" w:eastAsia="Times New Roman" w:hAnsi="Times New Roman" w:cs="Times New Roman"/>
-          <w:b/>
-          <w:bCs/>
-          <w:sz w:val="36"/>
-          <w:szCs w:val="36"/>
-          <w:lang w:eastAsia="fr-FR"/>
-        </w:rPr>
-        <w:t xml:space="preserve"> → </w:t>
-      </w:r>
-      <w:proofErr w:type="spellStart"/>
-      <w:r>
-        <w:rPr>
-          <w:rFonts w:ascii="Times New Roman" w:eastAsia="Times New Roman" w:hAnsi="Times New Roman" w:cs="Times New Roman"/>
-          <w:b/>
-          <w:bCs/>
-          <w:sz w:val="36"/>
-          <w:szCs w:val="36"/>
-          <w:lang w:eastAsia="fr-FR"/>
-        </w:rPr>
-        <w:t>savings_goals</w:t>
-      </w:r>
-      <w:proofErr w:type="spellEnd"/>
+        <w:t>users → savings_goals</w:t>
+      </w:r>
     </w:p>
     <w:p>
       <w:pPr>
@@ -14059,8 +12726,6 @@
           <w:lang w:eastAsia="fr-FR"/>
         </w:rPr>
       </w:pPr>
-      <w:proofErr w:type="spellStart"/>
-      <w:proofErr w:type="gramStart"/>
       <w:r>
         <w:rPr>
           <w:rFonts w:ascii="Times New Roman" w:eastAsia="Times New Roman" w:hAnsi="Times New Roman" w:cs="Times New Roman"/>
@@ -14070,34 +12735,8 @@
           <w:szCs w:val="36"/>
           <w:lang w:eastAsia="fr-FR"/>
         </w:rPr>
-        <w:t>categories</w:t>
-      </w:r>
-      <w:proofErr w:type="spellEnd"/>
-      <w:proofErr w:type="gramEnd"/>
-      <w:r>
-        <w:rPr>
-          <w:rFonts w:ascii="Times New Roman" w:eastAsia="Times New Roman" w:hAnsi="Times New Roman" w:cs="Times New Roman"/>
-          <w:b/>
-          <w:bCs/>
-          <w:sz w:val="36"/>
-          <w:szCs w:val="36"/>
-          <w:lang w:eastAsia="fr-FR"/>
-        </w:rPr>
-        <w:t xml:space="preserve"> → </w:t>
-      </w:r>
-      <w:proofErr w:type="spellStart"/>
-      <w:r>
-        <w:rPr>
-          <w:rFonts w:ascii="Times New Roman" w:eastAsia="Times New Roman" w:hAnsi="Times New Roman" w:cs="Times New Roman"/>
-          <w:b/>
-          <w:bCs/>
-          <w:sz w:val="36"/>
-          <w:szCs w:val="36"/>
-          <w:lang w:eastAsia="fr-FR"/>
-        </w:rPr>
-        <w:t>expenses</w:t>
-      </w:r>
-      <w:proofErr w:type="spellEnd"/>
+        <w:t>categories → expenses</w:t>
+      </w:r>
     </w:p>
     <w:p>
       <w:pPr>
@@ -14172,8 +12811,6 @@
           <w:lang w:eastAsia="fr-FR"/>
         </w:rPr>
       </w:pPr>
-      <w:proofErr w:type="spellStart"/>
-      <w:proofErr w:type="gramStart"/>
       <w:r>
         <w:rPr>
           <w:rFonts w:ascii="Times New Roman" w:eastAsia="Times New Roman" w:hAnsi="Times New Roman" w:cs="Times New Roman"/>
@@ -14183,34 +12820,8 @@
           <w:szCs w:val="36"/>
           <w:lang w:eastAsia="fr-FR"/>
         </w:rPr>
-        <w:t>accounts</w:t>
-      </w:r>
-      <w:proofErr w:type="spellEnd"/>
-      <w:proofErr w:type="gramEnd"/>
-      <w:r>
-        <w:rPr>
-          <w:rFonts w:ascii="Times New Roman" w:eastAsia="Times New Roman" w:hAnsi="Times New Roman" w:cs="Times New Roman"/>
-          <w:b/>
-          <w:bCs/>
-          <w:sz w:val="36"/>
-          <w:szCs w:val="36"/>
-          <w:lang w:eastAsia="fr-FR"/>
-        </w:rPr>
-        <w:t xml:space="preserve"> → </w:t>
-      </w:r>
-      <w:proofErr w:type="spellStart"/>
-      <w:r>
-        <w:rPr>
-          <w:rFonts w:ascii="Times New Roman" w:eastAsia="Times New Roman" w:hAnsi="Times New Roman" w:cs="Times New Roman"/>
-          <w:b/>
-          <w:bCs/>
-          <w:sz w:val="36"/>
-          <w:szCs w:val="36"/>
-          <w:lang w:eastAsia="fr-FR"/>
-        </w:rPr>
-        <w:t>expenses</w:t>
-      </w:r>
-      <w:proofErr w:type="spellEnd"/>
+        <w:t>accounts → expenses</w:t>
+      </w:r>
     </w:p>
     <w:p>
       <w:pPr>
@@ -14285,8 +12896,6 @@
           <w:lang w:eastAsia="fr-FR"/>
         </w:rPr>
       </w:pPr>
-      <w:proofErr w:type="spellStart"/>
-      <w:proofErr w:type="gramStart"/>
       <w:r>
         <w:rPr>
           <w:rFonts w:ascii="Times New Roman" w:eastAsia="Times New Roman" w:hAnsi="Times New Roman" w:cs="Times New Roman"/>
@@ -14296,34 +12905,8 @@
           <w:szCs w:val="36"/>
           <w:lang w:eastAsia="fr-FR"/>
         </w:rPr>
-        <w:t>accounts</w:t>
-      </w:r>
-      <w:proofErr w:type="spellEnd"/>
-      <w:proofErr w:type="gramEnd"/>
-      <w:r>
-        <w:rPr>
-          <w:rFonts w:ascii="Times New Roman" w:eastAsia="Times New Roman" w:hAnsi="Times New Roman" w:cs="Times New Roman"/>
-          <w:b/>
-          <w:bCs/>
-          <w:sz w:val="36"/>
-          <w:szCs w:val="36"/>
-          <w:lang w:eastAsia="fr-FR"/>
-        </w:rPr>
-        <w:t xml:space="preserve"> → </w:t>
-      </w:r>
-      <w:proofErr w:type="spellStart"/>
-      <w:r>
-        <w:rPr>
-          <w:rFonts w:ascii="Times New Roman" w:eastAsia="Times New Roman" w:hAnsi="Times New Roman" w:cs="Times New Roman"/>
-          <w:b/>
-          <w:bCs/>
-          <w:sz w:val="36"/>
-          <w:szCs w:val="36"/>
-          <w:lang w:eastAsia="fr-FR"/>
-        </w:rPr>
-        <w:t>incomes</w:t>
-      </w:r>
-      <w:proofErr w:type="spellEnd"/>
+        <w:t>accounts → incomes</w:t>
+      </w:r>
     </w:p>
     <w:p>
       <w:pPr>
@@ -15033,7 +13616,6 @@
           <w:lang w:eastAsia="fr-FR"/>
         </w:rPr>
       </w:pPr>
-      <w:proofErr w:type="gramStart"/>
       <w:r>
         <w:rPr>
           <w:rFonts w:ascii="Courier New" w:eastAsia="Times New Roman" w:hAnsi="Courier New" w:cs="Courier New"/>
@@ -15041,17 +13623,7 @@
           <w:szCs w:val="20"/>
           <w:lang w:eastAsia="fr-FR"/>
         </w:rPr>
-        <w:t>id</w:t>
-      </w:r>
-      <w:proofErr w:type="gramEnd"/>
-      <w:r>
-        <w:rPr>
-          <w:rFonts w:ascii="Courier New" w:eastAsia="Times New Roman" w:hAnsi="Courier New" w:cs="Courier New"/>
-          <w:sz w:val="20"/>
-          <w:szCs w:val="20"/>
-          <w:lang w:eastAsia="fr-FR"/>
-        </w:rPr>
-        <w:t xml:space="preserve"> (PK)</w:t>
+        <w:t>id (PK)</w:t>
       </w:r>
     </w:p>
     <w:p>
@@ -15369,7 +13941,6 @@
           <w:lang w:eastAsia="fr-FR"/>
         </w:rPr>
       </w:pPr>
-      <w:proofErr w:type="gramStart"/>
       <w:r>
         <w:rPr>
           <w:rFonts w:ascii="Courier New" w:eastAsia="Times New Roman" w:hAnsi="Courier New" w:cs="Courier New"/>
@@ -15377,17 +13948,7 @@
           <w:szCs w:val="20"/>
           <w:lang w:eastAsia="fr-FR"/>
         </w:rPr>
-        <w:t>id</w:t>
-      </w:r>
-      <w:proofErr w:type="gramEnd"/>
-      <w:r>
-        <w:rPr>
-          <w:rFonts w:ascii="Courier New" w:eastAsia="Times New Roman" w:hAnsi="Courier New" w:cs="Courier New"/>
-          <w:sz w:val="20"/>
-          <w:szCs w:val="20"/>
-          <w:lang w:eastAsia="fr-FR"/>
-        </w:rPr>
-        <w:t xml:space="preserve"> (PK)         id (PK)</w:t>
+        <w:t>id (PK)         id (PK)</w:t>
       </w:r>
     </w:p>
     <w:p>
@@ -15418,8 +13979,6 @@
           <w:lang w:eastAsia="fr-FR"/>
         </w:rPr>
       </w:pPr>
-      <w:proofErr w:type="spellStart"/>
-      <w:proofErr w:type="gramStart"/>
       <w:r>
         <w:rPr>
           <w:rFonts w:ascii="Courier New" w:eastAsia="Times New Roman" w:hAnsi="Courier New" w:cs="Courier New"/>
@@ -15427,47 +13986,7 @@
           <w:szCs w:val="20"/>
           <w:lang w:eastAsia="fr-FR"/>
         </w:rPr>
-        <w:t>user</w:t>
-      </w:r>
-      <w:proofErr w:type="gramEnd"/>
-      <w:r>
-        <w:rPr>
-          <w:rFonts w:ascii="Courier New" w:eastAsia="Times New Roman" w:hAnsi="Courier New" w:cs="Courier New"/>
-          <w:sz w:val="20"/>
-          <w:szCs w:val="20"/>
-          <w:lang w:eastAsia="fr-FR"/>
-        </w:rPr>
-        <w:t>_id</w:t>
-      </w:r>
-      <w:proofErr w:type="spellEnd"/>
-      <w:r>
-        <w:rPr>
-          <w:rFonts w:ascii="Courier New" w:eastAsia="Times New Roman" w:hAnsi="Courier New" w:cs="Courier New"/>
-          <w:sz w:val="20"/>
-          <w:szCs w:val="20"/>
-          <w:lang w:eastAsia="fr-FR"/>
-        </w:rPr>
-        <w:t xml:space="preserve"> (FK)    </w:t>
-      </w:r>
-      <w:proofErr w:type="spellStart"/>
-      <w:r>
-        <w:rPr>
-          <w:rFonts w:ascii="Courier New" w:eastAsia="Times New Roman" w:hAnsi="Courier New" w:cs="Courier New"/>
-          <w:sz w:val="20"/>
-          <w:szCs w:val="20"/>
-          <w:lang w:eastAsia="fr-FR"/>
-        </w:rPr>
-        <w:t>user_id</w:t>
-      </w:r>
-      <w:proofErr w:type="spellEnd"/>
-      <w:r>
-        <w:rPr>
-          <w:rFonts w:ascii="Courier New" w:eastAsia="Times New Roman" w:hAnsi="Courier New" w:cs="Courier New"/>
-          <w:sz w:val="20"/>
-          <w:szCs w:val="20"/>
-          <w:lang w:eastAsia="fr-FR"/>
-        </w:rPr>
-        <w:t xml:space="preserve"> (FK)</w:t>
+        <w:t>user_id (FK)    user_id (FK)</w:t>
       </w:r>
     </w:p>
     <w:p>
@@ -15686,27 +14205,7 @@
           <w:szCs w:val="20"/>
           <w:lang w:eastAsia="fr-FR"/>
         </w:rPr>
-        <w:t xml:space="preserve">    │          </w:t>
-      </w:r>
-      <w:proofErr w:type="spellStart"/>
-      <w:r>
-        <w:rPr>
-          <w:rFonts w:ascii="Courier New" w:eastAsia="Times New Roman" w:hAnsi="Courier New" w:cs="Courier New"/>
-          <w:sz w:val="20"/>
-          <w:szCs w:val="20"/>
-          <w:lang w:eastAsia="fr-FR"/>
-        </w:rPr>
-        <w:t>category_id</w:t>
-      </w:r>
-      <w:proofErr w:type="spellEnd"/>
-      <w:r>
-        <w:rPr>
-          <w:rFonts w:ascii="Courier New" w:eastAsia="Times New Roman" w:hAnsi="Courier New" w:cs="Courier New"/>
-          <w:sz w:val="20"/>
-          <w:szCs w:val="20"/>
-          <w:lang w:eastAsia="fr-FR"/>
-        </w:rPr>
-        <w:t xml:space="preserve"> (FK)</w:t>
+        <w:t xml:space="preserve">    │          category_id (FK)</w:t>
       </w:r>
     </w:p>
     <w:p>
@@ -15956,8 +14455,6 @@
           <w:lang w:eastAsia="fr-FR"/>
         </w:rPr>
       </w:pPr>
-      <w:proofErr w:type="spellStart"/>
-      <w:proofErr w:type="gramStart"/>
       <w:r>
         <w:rPr>
           <w:rFonts w:ascii="Courier New" w:eastAsia="Times New Roman" w:hAnsi="Courier New" w:cs="Courier New"/>
@@ -15965,47 +14462,7 @@
           <w:szCs w:val="20"/>
           <w:lang w:eastAsia="fr-FR"/>
         </w:rPr>
-        <w:t>account</w:t>
-      </w:r>
-      <w:proofErr w:type="gramEnd"/>
-      <w:r>
-        <w:rPr>
-          <w:rFonts w:ascii="Courier New" w:eastAsia="Times New Roman" w:hAnsi="Courier New" w:cs="Courier New"/>
-          <w:sz w:val="20"/>
-          <w:szCs w:val="20"/>
-          <w:lang w:eastAsia="fr-FR"/>
-        </w:rPr>
-        <w:t>_id</w:t>
-      </w:r>
-      <w:proofErr w:type="spellEnd"/>
-      <w:r>
-        <w:rPr>
-          <w:rFonts w:ascii="Courier New" w:eastAsia="Times New Roman" w:hAnsi="Courier New" w:cs="Courier New"/>
-          <w:sz w:val="20"/>
-          <w:szCs w:val="20"/>
-          <w:lang w:eastAsia="fr-FR"/>
-        </w:rPr>
-        <w:t xml:space="preserve">(FK)   </w:t>
-      </w:r>
-      <w:proofErr w:type="spellStart"/>
-      <w:r>
-        <w:rPr>
-          <w:rFonts w:ascii="Courier New" w:eastAsia="Times New Roman" w:hAnsi="Courier New" w:cs="Courier New"/>
-          <w:sz w:val="20"/>
-          <w:szCs w:val="20"/>
-          <w:lang w:eastAsia="fr-FR"/>
-        </w:rPr>
-        <w:t>account_id</w:t>
-      </w:r>
-      <w:proofErr w:type="spellEnd"/>
-      <w:r>
-        <w:rPr>
-          <w:rFonts w:ascii="Courier New" w:eastAsia="Times New Roman" w:hAnsi="Courier New" w:cs="Courier New"/>
-          <w:sz w:val="20"/>
-          <w:szCs w:val="20"/>
-          <w:lang w:eastAsia="fr-FR"/>
-        </w:rPr>
-        <w:t>(FK)</w:t>
+        <w:t>account_id(FK)   account_id(FK)</w:t>
       </w:r>
     </w:p>
     <w:p>
@@ -16036,8 +14493,6 @@
           <w:lang w:eastAsia="fr-FR"/>
         </w:rPr>
       </w:pPr>
-      <w:proofErr w:type="spellStart"/>
-      <w:proofErr w:type="gramStart"/>
       <w:r>
         <w:rPr>
           <w:rFonts w:ascii="Courier New" w:eastAsia="Times New Roman" w:hAnsi="Courier New" w:cs="Courier New"/>
@@ -16045,47 +14500,7 @@
           <w:szCs w:val="20"/>
           <w:lang w:eastAsia="fr-FR"/>
         </w:rPr>
-        <w:t>user</w:t>
-      </w:r>
-      <w:proofErr w:type="gramEnd"/>
-      <w:r>
-        <w:rPr>
-          <w:rFonts w:ascii="Courier New" w:eastAsia="Times New Roman" w:hAnsi="Courier New" w:cs="Courier New"/>
-          <w:sz w:val="20"/>
-          <w:szCs w:val="20"/>
-          <w:lang w:eastAsia="fr-FR"/>
-        </w:rPr>
-        <w:t>_id</w:t>
-      </w:r>
-      <w:proofErr w:type="spellEnd"/>
-      <w:r>
-        <w:rPr>
-          <w:rFonts w:ascii="Courier New" w:eastAsia="Times New Roman" w:hAnsi="Courier New" w:cs="Courier New"/>
-          <w:sz w:val="20"/>
-          <w:szCs w:val="20"/>
-          <w:lang w:eastAsia="fr-FR"/>
-        </w:rPr>
-        <w:t xml:space="preserve">(FK)      </w:t>
-      </w:r>
-      <w:proofErr w:type="spellStart"/>
-      <w:r>
-        <w:rPr>
-          <w:rFonts w:ascii="Courier New" w:eastAsia="Times New Roman" w:hAnsi="Courier New" w:cs="Courier New"/>
-          <w:sz w:val="20"/>
-          <w:szCs w:val="20"/>
-          <w:lang w:eastAsia="fr-FR"/>
-        </w:rPr>
-        <w:t>user_id</w:t>
-      </w:r>
-      <w:proofErr w:type="spellEnd"/>
-      <w:r>
-        <w:rPr>
-          <w:rFonts w:ascii="Courier New" w:eastAsia="Times New Roman" w:hAnsi="Courier New" w:cs="Courier New"/>
-          <w:sz w:val="20"/>
-          <w:szCs w:val="20"/>
-          <w:lang w:eastAsia="fr-FR"/>
-        </w:rPr>
-        <w:t>(FK)</w:t>
+        <w:t>user_id(FK)      user_id(FK)</w:t>
       </w:r>
     </w:p>
     <w:p>
@@ -16106,9 +14521,20 @@
           <w:lang w:eastAsia="fr-FR"/>
         </w:rPr>
         <w:pict w14:anchorId="53E5AD0D">
-          <v:rect id="_x0000_i1070" style="width:0;height:1.5pt" o:hralign="center" o:hrstd="t" o:hr="t" fillcolor="#a0a0a0" stroked="f"/>
+          <v:rect id="_x0000_i1085" style="width:0;height:1.5pt" o:hralign="center" o:bullet="t" o:hrstd="t" o:hr="t" fillcolor="#a0a0a0" stroked="f"/>
         </w:pict>
       </w:r>
+    </w:p>
+    <w:p>
+      <w:pPr>
+        <w:spacing w:after="0" w:line="240" w:lineRule="auto"/>
+        <w:rPr>
+          <w:rFonts w:ascii="Times New Roman" w:eastAsia="Times New Roman" w:hAnsi="Times New Roman" w:cs="Times New Roman"/>
+          <w:sz w:val="24"/>
+          <w:szCs w:val="24"/>
+          <w:lang w:eastAsia="fr-FR"/>
+        </w:rPr>
+      </w:pPr>
     </w:p>
     <w:p>
       <w:pPr>
@@ -16459,7 +14885,6 @@
                 <w:lang w:eastAsia="fr-FR"/>
               </w:rPr>
             </w:pPr>
-            <w:proofErr w:type="gramStart"/>
             <w:r>
               <w:rPr>
                 <w:rFonts w:ascii="Times New Roman" w:eastAsia="Times New Roman" w:hAnsi="Times New Roman" w:cs="Times New Roman"/>
@@ -16467,17 +14892,7 @@
                 <w:szCs w:val="24"/>
                 <w:lang w:eastAsia="fr-FR"/>
               </w:rPr>
-              <w:t>DECIMAL(</w:t>
-            </w:r>
-            <w:proofErr w:type="gramEnd"/>
-            <w:r>
-              <w:rPr>
-                <w:rFonts w:ascii="Times New Roman" w:eastAsia="Times New Roman" w:hAnsi="Times New Roman" w:cs="Times New Roman"/>
-                <w:sz w:val="24"/>
-                <w:szCs w:val="24"/>
-                <w:lang w:eastAsia="fr-FR"/>
-              </w:rPr>
-              <w:t>12,2)</w:t>
+              <w:t>DECIMAL(12,2)</w:t>
             </w:r>
           </w:p>
         </w:tc>
@@ -16764,8 +15179,6 @@
           <w:lang w:eastAsia="fr-FR"/>
         </w:rPr>
       </w:pPr>
-      <w:proofErr w:type="spellStart"/>
-      <w:proofErr w:type="gramStart"/>
       <w:r>
         <w:rPr>
           <w:rFonts w:ascii="Courier New" w:eastAsia="Times New Roman" w:hAnsi="Courier New" w:cs="Courier New"/>
@@ -16773,18 +15186,7 @@
           <w:szCs w:val="20"/>
           <w:lang w:eastAsia="fr-FR"/>
         </w:rPr>
-        <w:t>amount</w:t>
-      </w:r>
-      <w:proofErr w:type="spellEnd"/>
-      <w:proofErr w:type="gramEnd"/>
-      <w:r>
-        <w:rPr>
-          <w:rFonts w:ascii="Courier New" w:eastAsia="Times New Roman" w:hAnsi="Courier New" w:cs="Courier New"/>
-          <w:sz w:val="20"/>
-          <w:szCs w:val="20"/>
-          <w:lang w:eastAsia="fr-FR"/>
-        </w:rPr>
-        <w:t xml:space="preserve"> DECIMAL(12,2)</w:t>
+        <w:t>amount DECIMAL(12,2)</w:t>
       </w:r>
     </w:p>
     <w:p>
@@ -17094,8 +15496,6 @@
           <w:lang w:eastAsia="fr-FR"/>
         </w:rPr>
       </w:pPr>
-      <w:proofErr w:type="spellStart"/>
-      <w:proofErr w:type="gramStart"/>
       <w:r>
         <w:rPr>
           <w:rFonts w:ascii="Courier New" w:eastAsia="Times New Roman" w:hAnsi="Courier New" w:cs="Courier New"/>
@@ -17103,47 +15503,7 @@
           <w:szCs w:val="20"/>
           <w:lang w:eastAsia="fr-FR"/>
         </w:rPr>
-        <w:t>user</w:t>
-      </w:r>
-      <w:proofErr w:type="gramEnd"/>
-      <w:r>
-        <w:rPr>
-          <w:rFonts w:ascii="Courier New" w:eastAsia="Times New Roman" w:hAnsi="Courier New" w:cs="Courier New"/>
-          <w:sz w:val="20"/>
-          <w:szCs w:val="20"/>
-          <w:lang w:eastAsia="fr-FR"/>
-        </w:rPr>
-        <w:t>_id</w:t>
-      </w:r>
-      <w:proofErr w:type="spellEnd"/>
-      <w:r>
-        <w:rPr>
-          <w:rFonts w:ascii="Courier New" w:eastAsia="Times New Roman" w:hAnsi="Courier New" w:cs="Courier New"/>
-          <w:sz w:val="20"/>
-          <w:szCs w:val="20"/>
-          <w:lang w:eastAsia="fr-FR"/>
-        </w:rPr>
-        <w:t xml:space="preserve"> REFERENCES </w:t>
-      </w:r>
-      <w:proofErr w:type="spellStart"/>
-      <w:r>
-        <w:rPr>
-          <w:rFonts w:ascii="Courier New" w:eastAsia="Times New Roman" w:hAnsi="Courier New" w:cs="Courier New"/>
-          <w:sz w:val="20"/>
-          <w:szCs w:val="20"/>
-          <w:lang w:eastAsia="fr-FR"/>
-        </w:rPr>
-        <w:t>users</w:t>
-      </w:r>
-      <w:proofErr w:type="spellEnd"/>
-      <w:r>
-        <w:rPr>
-          <w:rFonts w:ascii="Courier New" w:eastAsia="Times New Roman" w:hAnsi="Courier New" w:cs="Courier New"/>
-          <w:sz w:val="20"/>
-          <w:szCs w:val="20"/>
-          <w:lang w:eastAsia="fr-FR"/>
-        </w:rPr>
-        <w:t>(id)</w:t>
+        <w:t>user_id REFERENCES users(id)</w:t>
       </w:r>
     </w:p>
     <w:p>
@@ -17223,7 +15583,6 @@
           <w:lang w:eastAsia="fr-FR"/>
         </w:rPr>
       </w:pPr>
-      <w:proofErr w:type="gramStart"/>
       <w:r>
         <w:rPr>
           <w:rFonts w:ascii="Courier New" w:eastAsia="Times New Roman" w:hAnsi="Courier New" w:cs="Courier New"/>
@@ -17231,17 +15590,7 @@
           <w:szCs w:val="20"/>
           <w:lang w:eastAsia="fr-FR"/>
         </w:rPr>
-        <w:t>UNIQUE(</w:t>
-      </w:r>
-      <w:proofErr w:type="gramEnd"/>
-      <w:r>
-        <w:rPr>
-          <w:rFonts w:ascii="Courier New" w:eastAsia="Times New Roman" w:hAnsi="Courier New" w:cs="Courier New"/>
-          <w:sz w:val="20"/>
-          <w:szCs w:val="20"/>
-          <w:lang w:eastAsia="fr-FR"/>
-        </w:rPr>
-        <w:t>email)</w:t>
+        <w:t>UNIQUE(email)</w:t>
       </w:r>
     </w:p>
     <w:p>
@@ -17321,7 +15670,6 @@
           <w:lang w:eastAsia="fr-FR"/>
         </w:rPr>
       </w:pPr>
-      <w:proofErr w:type="gramStart"/>
       <w:r>
         <w:rPr>
           <w:rFonts w:ascii="Courier New" w:eastAsia="Times New Roman" w:hAnsi="Courier New" w:cs="Courier New"/>
@@ -17329,28 +15677,7 @@
           <w:szCs w:val="20"/>
           <w:lang w:eastAsia="fr-FR"/>
         </w:rPr>
-        <w:t>CHECK(</w:t>
-      </w:r>
-      <w:proofErr w:type="spellStart"/>
-      <w:proofErr w:type="gramEnd"/>
-      <w:r>
-        <w:rPr>
-          <w:rFonts w:ascii="Courier New" w:eastAsia="Times New Roman" w:hAnsi="Courier New" w:cs="Courier New"/>
-          <w:sz w:val="20"/>
-          <w:szCs w:val="20"/>
-          <w:lang w:eastAsia="fr-FR"/>
-        </w:rPr>
-        <w:t>amount</w:t>
-      </w:r>
-      <w:proofErr w:type="spellEnd"/>
-      <w:r>
-        <w:rPr>
-          <w:rFonts w:ascii="Courier New" w:eastAsia="Times New Roman" w:hAnsi="Courier New" w:cs="Courier New"/>
-          <w:sz w:val="20"/>
-          <w:szCs w:val="20"/>
-          <w:lang w:eastAsia="fr-FR"/>
-        </w:rPr>
-        <w:t xml:space="preserve"> &gt; 0)</w:t>
+        <w:t>CHECK(amount &gt; 0)</w:t>
       </w:r>
     </w:p>
     <w:p>
@@ -17461,25 +15788,14 @@
           <w:lang w:eastAsia="fr-FR"/>
         </w:rPr>
       </w:pPr>
-      <w:proofErr w:type="gramStart"/>
-      <w:r>
-        <w:rPr>
-          <w:rFonts w:ascii="Times New Roman" w:eastAsia="Times New Roman" w:hAnsi="Times New Roman" w:cs="Times New Roman"/>
-          <w:sz w:val="24"/>
-          <w:szCs w:val="24"/>
-          <w:lang w:eastAsia="fr-FR"/>
-        </w:rPr>
-        <w:t>supprimer</w:t>
-      </w:r>
-      <w:proofErr w:type="gramEnd"/>
-      <w:r>
-        <w:rPr>
-          <w:rFonts w:ascii="Times New Roman" w:eastAsia="Times New Roman" w:hAnsi="Times New Roman" w:cs="Times New Roman"/>
-          <w:sz w:val="24"/>
-          <w:szCs w:val="24"/>
-          <w:lang w:eastAsia="fr-FR"/>
-        </w:rPr>
-        <w:t xml:space="preserve"> ses dépenses</w:t>
+      <w:r>
+        <w:rPr>
+          <w:rFonts w:ascii="Times New Roman" w:eastAsia="Times New Roman" w:hAnsi="Times New Roman" w:cs="Times New Roman"/>
+          <w:sz w:val="24"/>
+          <w:szCs w:val="24"/>
+          <w:lang w:eastAsia="fr-FR"/>
+        </w:rPr>
+        <w:t>supprimer ses dépenses</w:t>
       </w:r>
     </w:p>
     <w:p>
@@ -17496,25 +15812,14 @@
           <w:lang w:eastAsia="fr-FR"/>
         </w:rPr>
       </w:pPr>
-      <w:proofErr w:type="gramStart"/>
-      <w:r>
-        <w:rPr>
-          <w:rFonts w:ascii="Times New Roman" w:eastAsia="Times New Roman" w:hAnsi="Times New Roman" w:cs="Times New Roman"/>
-          <w:sz w:val="24"/>
-          <w:szCs w:val="24"/>
-          <w:lang w:eastAsia="fr-FR"/>
-        </w:rPr>
-        <w:t>supprimer</w:t>
-      </w:r>
-      <w:proofErr w:type="gramEnd"/>
-      <w:r>
-        <w:rPr>
-          <w:rFonts w:ascii="Times New Roman" w:eastAsia="Times New Roman" w:hAnsi="Times New Roman" w:cs="Times New Roman"/>
-          <w:sz w:val="24"/>
-          <w:szCs w:val="24"/>
-          <w:lang w:eastAsia="fr-FR"/>
-        </w:rPr>
-        <w:t xml:space="preserve"> ses revenus</w:t>
+      <w:r>
+        <w:rPr>
+          <w:rFonts w:ascii="Times New Roman" w:eastAsia="Times New Roman" w:hAnsi="Times New Roman" w:cs="Times New Roman"/>
+          <w:sz w:val="24"/>
+          <w:szCs w:val="24"/>
+          <w:lang w:eastAsia="fr-FR"/>
+        </w:rPr>
+        <w:t>supprimer ses revenus</w:t>
       </w:r>
     </w:p>
     <w:p>
@@ -17745,8 +16050,6 @@
           <w:lang w:eastAsia="fr-FR"/>
         </w:rPr>
       </w:pPr>
-      <w:proofErr w:type="spellStart"/>
-      <w:proofErr w:type="gramStart"/>
       <w:r>
         <w:rPr>
           <w:rFonts w:ascii="Courier New" w:eastAsia="Times New Roman" w:hAnsi="Courier New" w:cs="Courier New"/>
@@ -17754,27 +16057,7 @@
           <w:szCs w:val="20"/>
           <w:lang w:eastAsia="fr-FR"/>
         </w:rPr>
-        <w:t>created</w:t>
-      </w:r>
-      <w:proofErr w:type="gramEnd"/>
-      <w:r>
-        <w:rPr>
-          <w:rFonts w:ascii="Courier New" w:eastAsia="Times New Roman" w:hAnsi="Courier New" w:cs="Courier New"/>
-          <w:sz w:val="20"/>
-          <w:szCs w:val="20"/>
-          <w:lang w:eastAsia="fr-FR"/>
-        </w:rPr>
-        <w:t>_at</w:t>
-      </w:r>
-      <w:proofErr w:type="spellEnd"/>
-      <w:r>
-        <w:rPr>
-          <w:rFonts w:ascii="Courier New" w:eastAsia="Times New Roman" w:hAnsi="Courier New" w:cs="Courier New"/>
-          <w:sz w:val="20"/>
-          <w:szCs w:val="20"/>
-          <w:lang w:eastAsia="fr-FR"/>
-        </w:rPr>
-        <w:t xml:space="preserve"> TIMESTAMP DEFAULT NOW()</w:t>
+        <w:t>created_at TIMESTAMP DEFAULT NOW()</w:t>
       </w:r>
     </w:p>
     <w:p>
@@ -17854,7 +16137,6 @@
           <w:lang w:eastAsia="fr-FR"/>
         </w:rPr>
       </w:pPr>
-      <w:proofErr w:type="gramStart"/>
       <w:r>
         <w:rPr>
           <w:rFonts w:ascii="Courier New" w:eastAsia="Times New Roman" w:hAnsi="Courier New" w:cs="Courier New"/>
@@ -17862,28 +16144,7 @@
           <w:szCs w:val="20"/>
           <w:lang w:eastAsia="fr-FR"/>
         </w:rPr>
-        <w:t>CHECK(</w:t>
-      </w:r>
-      <w:proofErr w:type="spellStart"/>
-      <w:proofErr w:type="gramEnd"/>
-      <w:r>
-        <w:rPr>
-          <w:rFonts w:ascii="Courier New" w:eastAsia="Times New Roman" w:hAnsi="Courier New" w:cs="Courier New"/>
-          <w:sz w:val="20"/>
-          <w:szCs w:val="20"/>
-          <w:lang w:eastAsia="fr-FR"/>
-        </w:rPr>
-        <w:t>month</w:t>
-      </w:r>
-      <w:proofErr w:type="spellEnd"/>
-      <w:r>
-        <w:rPr>
-          <w:rFonts w:ascii="Courier New" w:eastAsia="Times New Roman" w:hAnsi="Courier New" w:cs="Courier New"/>
-          <w:sz w:val="20"/>
-          <w:szCs w:val="20"/>
-          <w:lang w:eastAsia="fr-FR"/>
-        </w:rPr>
-        <w:t xml:space="preserve"> BETWEEN 1 AND 12)</w:t>
+        <w:t>CHECK(month BETWEEN 1 AND 12)</w:t>
       </w:r>
     </w:p>
     <w:p>
@@ -17963,8 +16224,6 @@
           <w:lang w:eastAsia="fr-FR"/>
         </w:rPr>
       </w:pPr>
-      <w:proofErr w:type="spellStart"/>
-      <w:proofErr w:type="gramStart"/>
       <w:r>
         <w:rPr>
           <w:rFonts w:ascii="Courier New" w:eastAsia="Times New Roman" w:hAnsi="Courier New" w:cs="Courier New"/>
@@ -17974,8 +16233,6 @@
         </w:rPr>
         <w:t>users</w:t>
       </w:r>
-      <w:proofErr w:type="spellEnd"/>
-      <w:proofErr w:type="gramEnd"/>
     </w:p>
     <w:p>
       <w:pPr>
@@ -18005,8 +16262,6 @@
           <w:lang w:eastAsia="fr-FR"/>
         </w:rPr>
       </w:pPr>
-      <w:proofErr w:type="spellStart"/>
-      <w:proofErr w:type="gramStart"/>
       <w:r>
         <w:rPr>
           <w:rFonts w:ascii="Courier New" w:eastAsia="Times New Roman" w:hAnsi="Courier New" w:cs="Courier New"/>
@@ -18016,8 +16271,6 @@
         </w:rPr>
         <w:t>accounts</w:t>
       </w:r>
-      <w:proofErr w:type="spellEnd"/>
-      <w:proofErr w:type="gramEnd"/>
     </w:p>
     <w:p>
       <w:pPr>
@@ -18047,8 +16300,6 @@
           <w:lang w:eastAsia="fr-FR"/>
         </w:rPr>
       </w:pPr>
-      <w:proofErr w:type="spellStart"/>
-      <w:proofErr w:type="gramStart"/>
       <w:r>
         <w:rPr>
           <w:rFonts w:ascii="Courier New" w:eastAsia="Times New Roman" w:hAnsi="Courier New" w:cs="Courier New"/>
@@ -18058,8 +16309,6 @@
         </w:rPr>
         <w:t>categories</w:t>
       </w:r>
-      <w:proofErr w:type="spellEnd"/>
-      <w:proofErr w:type="gramEnd"/>
     </w:p>
     <w:p>
       <w:pPr>
@@ -18089,8 +16338,6 @@
           <w:lang w:eastAsia="fr-FR"/>
         </w:rPr>
       </w:pPr>
-      <w:proofErr w:type="spellStart"/>
-      <w:proofErr w:type="gramStart"/>
       <w:r>
         <w:rPr>
           <w:rFonts w:ascii="Courier New" w:eastAsia="Times New Roman" w:hAnsi="Courier New" w:cs="Courier New"/>
@@ -18100,8 +16347,6 @@
         </w:rPr>
         <w:t>expenses</w:t>
       </w:r>
-      <w:proofErr w:type="spellEnd"/>
-      <w:proofErr w:type="gramEnd"/>
     </w:p>
     <w:p>
       <w:pPr>
@@ -18131,8 +16376,6 @@
           <w:lang w:eastAsia="fr-FR"/>
         </w:rPr>
       </w:pPr>
-      <w:proofErr w:type="spellStart"/>
-      <w:proofErr w:type="gramStart"/>
       <w:r>
         <w:rPr>
           <w:rFonts w:ascii="Courier New" w:eastAsia="Times New Roman" w:hAnsi="Courier New" w:cs="Courier New"/>
@@ -18142,8 +16385,6 @@
         </w:rPr>
         <w:t>incomes</w:t>
       </w:r>
-      <w:proofErr w:type="spellEnd"/>
-      <w:proofErr w:type="gramEnd"/>
     </w:p>
     <w:p>
       <w:pPr>
@@ -18173,7 +16414,6 @@
           <w:lang w:eastAsia="fr-FR"/>
         </w:rPr>
       </w:pPr>
-      <w:proofErr w:type="gramStart"/>
       <w:r>
         <w:rPr>
           <w:rFonts w:ascii="Courier New" w:eastAsia="Times New Roman" w:hAnsi="Courier New" w:cs="Courier New"/>
@@ -18183,7 +16423,6 @@
         </w:rPr>
         <w:t>budgets</w:t>
       </w:r>
-      <w:proofErr w:type="gramEnd"/>
     </w:p>
     <w:p>
       <w:pPr>
@@ -18213,8 +16452,6 @@
           <w:lang w:eastAsia="fr-FR"/>
         </w:rPr>
       </w:pPr>
-      <w:proofErr w:type="spellStart"/>
-      <w:proofErr w:type="gramStart"/>
       <w:r>
         <w:rPr>
           <w:rFonts w:ascii="Courier New" w:eastAsia="Times New Roman" w:hAnsi="Courier New" w:cs="Courier New"/>
@@ -18222,19 +16459,8 @@
           <w:szCs w:val="20"/>
           <w:lang w:eastAsia="fr-FR"/>
         </w:rPr>
-        <w:t>savings</w:t>
-      </w:r>
-      <w:proofErr w:type="gramEnd"/>
-      <w:r>
-        <w:rPr>
-          <w:rFonts w:ascii="Courier New" w:eastAsia="Times New Roman" w:hAnsi="Courier New" w:cs="Courier New"/>
-          <w:sz w:val="20"/>
-          <w:szCs w:val="20"/>
-          <w:lang w:eastAsia="fr-FR"/>
-        </w:rPr>
-        <w:t>_goals</w:t>
-      </w:r>
-      <w:proofErr w:type="spellEnd"/>
+        <w:t>savings_goals</w:t>
+      </w:r>
     </w:p>
     <w:p>
       <w:pPr>
@@ -18259,6 +16485,47 @@
       </w:r>
     </w:p>
     <w:p/>
+    <w:p/>
+    <w:p>
+      <w:r>
+        <w:lastRenderedPageBreak/>
+        <w:drawing>
+          <wp:inline distT="0" distB="0" distL="0" distR="0" wp14:anchorId="4C5B404C" wp14:editId="5F4A9780">
+            <wp:extent cx="5760720" cy="4800600"/>
+            <wp:effectExtent l="0" t="0" r="0" b="0"/>
+            <wp:docPr id="1" name="Image 1"/>
+            <wp:cNvGraphicFramePr>
+              <a:graphicFrameLocks xmlns:a="http://schemas.openxmlformats.org/drawingml/2006/main" noChangeAspect="1"/>
+            </wp:cNvGraphicFramePr>
+            <a:graphic xmlns:a="http://schemas.openxmlformats.org/drawingml/2006/main">
+              <a:graphicData uri="http://schemas.openxmlformats.org/drawingml/2006/picture">
+                <pic:pic xmlns:pic="http://schemas.openxmlformats.org/drawingml/2006/picture">
+                  <pic:nvPicPr>
+                    <pic:cNvPr id="1" name=""/>
+                    <pic:cNvPicPr/>
+                  </pic:nvPicPr>
+                  <pic:blipFill>
+                    <a:blip r:embed="rId8"/>
+                    <a:stretch>
+                      <a:fillRect/>
+                    </a:stretch>
+                  </pic:blipFill>
+                  <pic:spPr>
+                    <a:xfrm>
+                      <a:off x="0" y="0"/>
+                      <a:ext cx="5760720" cy="4800600"/>
+                    </a:xfrm>
+                    <a:prstGeom prst="rect">
+                      <a:avLst/>
+                    </a:prstGeom>
+                  </pic:spPr>
+                </pic:pic>
+              </a:graphicData>
+            </a:graphic>
+          </wp:inline>
+        </w:drawing>
+      </w:r>
+    </w:p>
     <w:sectPr>
       <w:pgSz w:w="11906" w:h="16838"/>
       <w:pgMar w:top="1417" w:right="1417" w:bottom="1417" w:left="1417" w:header="708" w:footer="708" w:gutter="0"/>
@@ -18271,6 +16538,11 @@
 
 <file path=word/numbering.xml><?xml version="1.0" encoding="utf-8"?>
 <w:numbering xmlns:wpc="http://schemas.microsoft.com/office/word/2010/wordprocessingCanvas" xmlns:cx="http://schemas.microsoft.com/office/drawing/2014/chartex" xmlns:cx1="http://schemas.microsoft.com/office/drawing/2015/9/8/chartex" xmlns:cx2="http://schemas.microsoft.com/office/drawing/2015/10/21/chartex" xmlns:cx3="http://schemas.microsoft.com/office/drawing/2016/5/9/chartex" xmlns:cx4="http://schemas.microsoft.com/office/drawing/2016/5/10/chartex" xmlns:cx5="http://schemas.microsoft.com/office/drawing/2016/5/11/chartex" xmlns:cx6="http://schemas.microsoft.com/office/drawing/2016/5/12/chartex" xmlns:cx7="http://schemas.microsoft.com/office/drawing/2016/5/13/chartex" xmlns:cx8="http://schemas.microsoft.com/office/drawing/2016/5/14/chartex" xmlns:mc="http://schemas.openxmlformats.org/markup-compatibility/2006" xmlns:aink="http://schemas.microsoft.com/office/drawing/2016/ink" xmlns:am3d="http://schemas.microsoft.com/office/drawing/2017/model3d" xmlns:o="urn:schemas-microsoft-com:office:office" xmlns:r="http://schemas.openxmlformats.org/officeDocument/2006/relationships" xmlns:m="http://schemas.openxmlformats.org/officeDocument/2006/math" xmlns:v="urn:schemas-microsoft-com:vml" xmlns:wp14="http://schemas.microsoft.com/office/word/2010/wordprocessingDrawing" xmlns:wp="http://schemas.openxmlformats.org/drawingml/2006/wordprocessingDrawing" xmlns:w10="urn:schemas-microsoft-com:office:word" xmlns:w="http://schemas.openxmlformats.org/wordprocessingml/2006/main" xmlns:w14="http://schemas.microsoft.com/office/word/2010/wordml" xmlns:w15="http://schemas.microsoft.com/office/word/2012/wordml" xmlns:w16cex="http://schemas.microsoft.com/office/word/2018/wordml/cex" xmlns:w16cid="http://schemas.microsoft.com/office/word/2016/wordml/cid" xmlns:w16="http://schemas.microsoft.com/office/word/2018/wordml" xmlns:w16sdtdh="http://schemas.microsoft.com/office/word/2020/wordml/sdtdatahash" xmlns:w16se="http://schemas.microsoft.com/office/word/2015/wordml/symex" xmlns:wpg="http://schemas.microsoft.com/office/word/2010/wordprocessingGroup" xmlns:wpi="http://schemas.microsoft.com/office/word/2010/wordprocessingInk" xmlns:wne="http://schemas.microsoft.com/office/word/2006/wordml" xmlns:wps="http://schemas.microsoft.com/office/word/2010/wordprocessingShape" mc:Ignorable="w14 w15 w16se w16cid w16 w16cex w16sdtdh wp14">
+  <w:numPicBullet w:numPicBulletId="0">
+    <w:pict>
+      <v:rect id="_x0000_i1030" style="width:0;height:1.5pt" o:hralign="center" o:bullet="t" o:hrstd="t" o:hr="t" fillcolor="#a0a0a0" stroked="f"/>
+    </w:pict>
+  </w:numPicBullet>
   <w:abstractNum w:abstractNumId="0" w15:restartNumberingAfterBreak="0">
     <w:nsid w:val="00D35532"/>
     <w:multiLevelType w:val="multilevel"/>

</xml_diff>